<commit_message>
Fix AI wording, repeated patterns, FAQs, and Quick Answer
- Removed AI patterns: "reads as", "signals intention", "deliberate"
  overuse, "illusion of density" repetition
- Replaced all 6 FAQs with unique questions not answered in body
  (SMP, hair colour, wash frequency, nutrition, hair systems, derma-rolling)
- Tightened Quick Answer for AEO/GEO with entity-rich phrasing
- Reduced overlap between Styling and Products sections
- Rebuilt DOCX with all changes

Co-Authored-By: Claude Opus 4.6 <noreply@anthropic.com>
Claude-Session: https://claude.ai/code/session_013k2EdyZEATdeqZhaNxEy9F
</commit_message>
<xml_diff>
--- a/Thin-Straight-Hair-Haircuts-for-Men.docx
+++ b/Thin-Straight-Hair-Haircuts-for-Men.docx
@@ -19,7 +19,6 @@
         <w:t xml:space="preserve">Thin Straight Hair Haircuts for Men: 25 Styles That Build Volume Without Fighting Your Texture</w:t>
       </w:r>
     </w:p>
-    <w:p/>
     <w:p>
       <w:pPr>
         <w:shd w:fill="f0f7f0" w:color="auto" w:val="clear"/>
@@ -42,7 +41,7 @@
           <w:sz w:val="24"/>
           <w:szCs w:val="24"/>
         </w:rPr>
-        <w:t xml:space="preserve">The best haircuts for men with thin straight hair keep length between one and three inches on top, use texture to create the illusion of density, and pair with a taper or fade on the sides. Textured crops, crew cuts, and French crops rank highest because they add movement to flat hair without exposing the scalp.</w:t>
+        <w:t xml:space="preserve">The best haircuts for men with thin straight hair — textured crops, crew cuts, French crops, and Caesar cuts — keep the top between one and three inches and pair with a taper or fade on the sides. Short, textured layers add volume to fine strands, and matte-finish products like clay or texture powder hold shape without weighing hair down.</w:t>
       </w:r>
     </w:p>
     <w:p>
@@ -119,20 +118,20 @@
           <w:sz w:val="24"/>
           <w:szCs w:val="24"/>
         </w:rPr>
-        <w:t xml:space="preserve">Thin straight hair lacks the natural body that wavy or curly textures provide. Every millimetre of extra length pulls hair downward, flattening it against the scalp and making sparse areas more visible. The best haircuts for men with thin straight hair remove weight at the ends through point cutting or razor texturising, keep the top between one and three inches, and graduate the sides with a taper or fade so the eye reads proportion rather than thinning.</w:t>
-      </w:r>
-    </w:p>
-    <w:p>
-      <w:pPr>
-        <w:spacing w:after="120" w:line="276"/>
-      </w:pPr>
-      <w:r>
-        <w:rPr>
-          <w:rFonts w:ascii="Georgia" w:cs="Georgia" w:eastAsia="Georgia" w:hAnsi="Georgia"/>
-          <w:sz w:val="24"/>
-          <w:szCs w:val="24"/>
-        </w:rPr>
-        <w:t xml:space="preserve">Clipper-over-comb blending matters more on thin straight hair than on any other texture. A hard line between lengths exposes density changes instantly. A gradual blend — especially through the parietal ridge where hair naturally thins — keeps the transition invisible.</w:t>
+        <w:t xml:space="preserve">Thin straight hair lacks the natural body that wavy or curly textures provide. Every extra millimetre of length pulls hair flat against the scalp, making sparse patches more obvious. The best haircuts for men with thin straight hair remove weight at the ends through point cutting or razor texturising, keep the top between one and three inches, and graduate the sides with a taper or fade so the proportions stay balanced.</w:t>
+      </w:r>
+    </w:p>
+    <w:p>
+      <w:pPr>
+        <w:spacing w:after="120" w:line="276"/>
+      </w:pPr>
+      <w:r>
+        <w:rPr>
+          <w:rFonts w:ascii="Georgia" w:cs="Georgia" w:eastAsia="Georgia" w:hAnsi="Georgia"/>
+          <w:sz w:val="24"/>
+          <w:szCs w:val="24"/>
+        </w:rPr>
+        <w:t xml:space="preserve">Clipper-over-comb blending matters more on thin straight hair than on any other texture. A hard line between lengths highlights density changes immediately. A gradual blend — especially through the parietal ridge where hair naturally thins — hides the transition entirely.</w:t>
       </w:r>
     </w:p>
     <w:p>
@@ -258,19 +257,10 @@
         <w:t xml:space="preserve">Low or mid fade on the sides, blending from a #1 or #2 guard</w:t>
       </w:r>
     </w:p>
-    <w:p/>
-    <w:p>
-      <w:pPr>
-        <w:spacing w:after="120" w:line="276"/>
-      </w:pPr>
-      <w:r>
-        <w:rPr>
-          <w:rFonts w:ascii="Georgia" w:cs="Georgia" w:eastAsia="Georgia" w:hAnsi="Georgia"/>
-          <w:sz w:val="24"/>
-          <w:szCs w:val="24"/>
-        </w:rPr>
-        <w:t xml:space="preserve"/>
-      </w:r>
+    <w:p>
+      <w:pPr>
+        <w:spacing w:after="120" w:line="276"/>
+      </w:pPr>
       <w:r>
         <w:rPr>
           <w:rFonts w:ascii="Georgia" w:cs="Georgia" w:eastAsia="Georgia" w:hAnsi="Georgia"/>
@@ -297,14 +287,6 @@
       <w:r>
         <w:rPr>
           <w:rFonts w:ascii="Georgia" w:cs="Georgia" w:eastAsia="Georgia" w:hAnsi="Georgia"/>
-          <w:sz w:val="24"/>
-          <w:szCs w:val="24"/>
-        </w:rPr>
-        <w:t xml:space="preserve"/>
-      </w:r>
-      <w:r>
-        <w:rPr>
-          <w:rFonts w:ascii="Georgia" w:cs="Georgia" w:eastAsia="Georgia" w:hAnsi="Georgia"/>
           <w:b/>
           <w:bCs/>
           <w:sz w:val="24"/>
@@ -321,18 +303,17 @@
         <w:t xml:space="preserve"> Straight, fine, slightly wavy</w:t>
       </w:r>
     </w:p>
-    <w:p/>
-    <w:p>
-      <w:pPr>
-        <w:spacing w:after="120" w:line="276"/>
-      </w:pPr>
-      <w:r>
-        <w:rPr>
-          <w:rFonts w:ascii="Georgia" w:cs="Georgia" w:eastAsia="Georgia" w:hAnsi="Georgia"/>
-          <w:sz w:val="24"/>
-          <w:szCs w:val="24"/>
-        </w:rPr>
-        <w:t xml:space="preserve">The textured crop is the single most effective haircut for thin straight hair because it does two things simultaneously: the choppy layers break up flat planes so the hair looks thicker, and the short length means gravity never pulls it down. I'd recommend this to any man walking into the chair for the first time with fine hair — it's forgiving to grow out, easy to style with a small amount of matte clay, and holds from morning to night without restyling. Ask your barber for point-cut texture on top with a mid fade at a #2 guard on the sides.</w:t>
+    <w:p>
+      <w:pPr>
+        <w:spacing w:after="120" w:line="276"/>
+      </w:pPr>
+      <w:r>
+        <w:rPr>
+          <w:rFonts w:ascii="Georgia" w:cs="Georgia" w:eastAsia="Georgia" w:hAnsi="Georgia"/>
+          <w:sz w:val="24"/>
+          <w:szCs w:val="24"/>
+        </w:rPr>
+        <w:t xml:space="preserve">The textured crop works better than any other cut on thin straight hair because the choppy layers break up flat planes so the hair looks thicker, and the short length stops gravity from pulling it down. I'd recommend this to any man walking into the chair for the first time with fine hair — it's forgiving to grow out, easy to style with a small amount of matte clay, and holds from morning to night without restyling. Ask your barber for point-cut texture on top with a mid fade at a #2 guard on the sides.</w:t>
       </w:r>
     </w:p>
     <w:p>
@@ -433,19 +414,10 @@
         <w:t xml:space="preserve">Tapered or faded sides, clean neckline</w:t>
       </w:r>
     </w:p>
-    <w:p/>
-    <w:p>
-      <w:pPr>
-        <w:spacing w:after="120" w:line="276"/>
-      </w:pPr>
-      <w:r>
-        <w:rPr>
-          <w:rFonts w:ascii="Georgia" w:cs="Georgia" w:eastAsia="Georgia" w:hAnsi="Georgia"/>
-          <w:sz w:val="24"/>
-          <w:szCs w:val="24"/>
-        </w:rPr>
-        <w:t xml:space="preserve"/>
-      </w:r>
+    <w:p>
+      <w:pPr>
+        <w:spacing w:after="120" w:line="276"/>
+      </w:pPr>
       <w:r>
         <w:rPr>
           <w:rFonts w:ascii="Georgia" w:cs="Georgia" w:eastAsia="Georgia" w:hAnsi="Georgia"/>
@@ -472,14 +444,6 @@
       <w:r>
         <w:rPr>
           <w:rFonts w:ascii="Georgia" w:cs="Georgia" w:eastAsia="Georgia" w:hAnsi="Georgia"/>
-          <w:sz w:val="24"/>
-          <w:szCs w:val="24"/>
-        </w:rPr>
-        <w:t xml:space="preserve"/>
-      </w:r>
-      <w:r>
-        <w:rPr>
-          <w:rFonts w:ascii="Georgia" w:cs="Georgia" w:eastAsia="Georgia" w:hAnsi="Georgia"/>
           <w:b/>
           <w:bCs/>
           <w:sz w:val="24"/>
@@ -496,18 +460,17 @@
         <w:t xml:space="preserve"> Straight, fine</w:t>
       </w:r>
     </w:p>
-    <w:p/>
-    <w:p>
-      <w:pPr>
-        <w:spacing w:after="120" w:line="276"/>
-      </w:pPr>
-      <w:r>
-        <w:rPr>
-          <w:rFonts w:ascii="Georgia" w:cs="Georgia" w:eastAsia="Georgia" w:hAnsi="Georgia"/>
-          <w:sz w:val="24"/>
-          <w:szCs w:val="24"/>
-        </w:rPr>
-        <w:t xml:space="preserve">The French crop pulls hair forward rather than up, which is the smartest move for thin straight hair at the hairline. That forward fringe covers a receding front while the short, blunt top creates a solid visual line that reads as density. Men with </w:t>
+    <w:p>
+      <w:pPr>
+        <w:spacing w:after="120" w:line="276"/>
+      </w:pPr>
+      <w:r>
+        <w:rPr>
+          <w:rFonts w:ascii="Georgia" w:cs="Georgia" w:eastAsia="Georgia" w:hAnsi="Georgia"/>
+          <w:sz w:val="24"/>
+          <w:szCs w:val="24"/>
+        </w:rPr>
+        <w:t xml:space="preserve">The French crop pulls hair forward rather than up, which is the smartest move for thin straight hair at the hairline. That forward fringe covers a receding front while the short, blunt top creates a solid visual line that looks fuller than it is. Men with </w:t>
       </w:r>
       <w:r>
         <w:rPr>
@@ -626,19 +589,10 @@
         <w:t xml:space="preserve">Optional skin fade on the sides for contrast</w:t>
       </w:r>
     </w:p>
-    <w:p/>
-    <w:p>
-      <w:pPr>
-        <w:spacing w:after="120" w:line="276"/>
-      </w:pPr>
-      <w:r>
-        <w:rPr>
-          <w:rFonts w:ascii="Georgia" w:cs="Georgia" w:eastAsia="Georgia" w:hAnsi="Georgia"/>
-          <w:sz w:val="24"/>
-          <w:szCs w:val="24"/>
-        </w:rPr>
-        <w:t xml:space="preserve"/>
-      </w:r>
+    <w:p>
+      <w:pPr>
+        <w:spacing w:after="120" w:line="276"/>
+      </w:pPr>
       <w:r>
         <w:rPr>
           <w:rFonts w:ascii="Georgia" w:cs="Georgia" w:eastAsia="Georgia" w:hAnsi="Georgia"/>
@@ -665,14 +619,6 @@
       <w:r>
         <w:rPr>
           <w:rFonts w:ascii="Georgia" w:cs="Georgia" w:eastAsia="Georgia" w:hAnsi="Georgia"/>
-          <w:sz w:val="24"/>
-          <w:szCs w:val="24"/>
-        </w:rPr>
-        <w:t xml:space="preserve"/>
-      </w:r>
-      <w:r>
-        <w:rPr>
-          <w:rFonts w:ascii="Georgia" w:cs="Georgia" w:eastAsia="Georgia" w:hAnsi="Georgia"/>
           <w:b/>
           <w:bCs/>
           <w:sz w:val="24"/>
@@ -689,18 +635,17 @@
         <w:t xml:space="preserve"> All — straight, wavy, curly, coiled</w:t>
       </w:r>
     </w:p>
-    <w:p/>
-    <w:p>
-      <w:pPr>
-        <w:spacing w:after="120" w:line="276"/>
-      </w:pPr>
-      <w:r>
-        <w:rPr>
-          <w:rFonts w:ascii="Georgia" w:cs="Georgia" w:eastAsia="Georgia" w:hAnsi="Georgia"/>
-          <w:sz w:val="24"/>
-          <w:szCs w:val="24"/>
-        </w:rPr>
-        <w:t xml:space="preserve">The buzz cut eliminates the contrast between thick and thin areas entirely. When hair is cut to a uniform half-inch or less, density differences disappear and the focus shifts to your bone structure — jawline, cheekbones, head shape. For men whose thinning has progressed beyond what textured cuts can disguise, a </w:t>
+    <w:p>
+      <w:pPr>
+        <w:spacing w:after="120" w:line="276"/>
+      </w:pPr>
+      <w:r>
+        <w:rPr>
+          <w:rFonts w:ascii="Georgia" w:cs="Georgia" w:eastAsia="Georgia" w:hAnsi="Georgia"/>
+          <w:sz w:val="24"/>
+          <w:szCs w:val="24"/>
+        </w:rPr>
+        <w:t xml:space="preserve">The buzz cut removes any contrast between thick and thin patches. When everything sits at a uniform half-inch or less, density gaps vanish and the focus moves to your jawline, cheekbones, and head shape. For men whose thinning has gone past what textured cuts can handle, a </w:t>
       </w:r>
       <w:r>
         <w:rPr>
@@ -718,7 +663,7 @@
           <w:sz w:val="24"/>
           <w:szCs w:val="24"/>
         </w:rPr>
-        <w:t xml:space="preserve"> is the cleanest reset. I've found that a #3 guard all over with a skin fade at the temples gives the most balanced result on straight hair. Zero styling, zero product, zero maintenance beyond a trim every two to three weeks.</w:t>
+        <w:t xml:space="preserve"> is the simplest fix. I've found that a #3 guard all over with a skin fade at the temples gives the most balanced result on straight hair. No styling, no product, no upkeep beyond a trim every two to three weeks.</w:t>
       </w:r>
     </w:p>
     <w:p>
@@ -819,19 +764,10 @@
         <w:t xml:space="preserve">Clean, structured silhouette</w:t>
       </w:r>
     </w:p>
-    <w:p/>
-    <w:p>
-      <w:pPr>
-        <w:spacing w:after="120" w:line="276"/>
-      </w:pPr>
-      <w:r>
-        <w:rPr>
-          <w:rFonts w:ascii="Georgia" w:cs="Georgia" w:eastAsia="Georgia" w:hAnsi="Georgia"/>
-          <w:sz w:val="24"/>
-          <w:szCs w:val="24"/>
-        </w:rPr>
-        <w:t xml:space="preserve"/>
-      </w:r>
+    <w:p>
+      <w:pPr>
+        <w:spacing w:after="120" w:line="276"/>
+      </w:pPr>
       <w:r>
         <w:rPr>
           <w:rFonts w:ascii="Georgia" w:cs="Georgia" w:eastAsia="Georgia" w:hAnsi="Georgia"/>
@@ -858,14 +794,6 @@
       <w:r>
         <w:rPr>
           <w:rFonts w:ascii="Georgia" w:cs="Georgia" w:eastAsia="Georgia" w:hAnsi="Georgia"/>
-          <w:sz w:val="24"/>
-          <w:szCs w:val="24"/>
-        </w:rPr>
-        <w:t xml:space="preserve"/>
-      </w:r>
-      <w:r>
-        <w:rPr>
-          <w:rFonts w:ascii="Georgia" w:cs="Georgia" w:eastAsia="Georgia" w:hAnsi="Georgia"/>
           <w:b/>
           <w:bCs/>
           <w:sz w:val="24"/>
@@ -882,18 +810,17 @@
         <w:t xml:space="preserve"> Straight, wavy, fine</w:t>
       </w:r>
     </w:p>
-    <w:p/>
-    <w:p>
-      <w:pPr>
-        <w:spacing w:after="120" w:line="276"/>
-      </w:pPr>
-      <w:r>
-        <w:rPr>
-          <w:rFonts w:ascii="Georgia" w:cs="Georgia" w:eastAsia="Georgia" w:hAnsi="Georgia"/>
-          <w:sz w:val="24"/>
-          <w:szCs w:val="24"/>
-        </w:rPr>
-        <w:t xml:space="preserve">The crew cut works for </w:t>
+    <w:p>
+      <w:pPr>
+        <w:spacing w:after="120" w:line="276"/>
+      </w:pPr>
+      <w:r>
+        <w:rPr>
+          <w:rFonts w:ascii="Georgia" w:cs="Georgia" w:eastAsia="Georgia" w:hAnsi="Georgia"/>
+          <w:sz w:val="24"/>
+          <w:szCs w:val="24"/>
+        </w:rPr>
+        <w:t xml:space="preserve">Among </w:t>
       </w:r>
       <w:r>
         <w:rPr>
@@ -911,7 +838,7 @@
           <w:sz w:val="24"/>
           <w:szCs w:val="24"/>
         </w:rPr>
-        <w:t xml:space="preserve"> because that front-to-back graduation creates natural lift right where thin hair tends to fall flat — at the forelock. The slightly longer front gives you enough length to push up or to the side with a dab of texture paste, while the shorter crown avoids the see-through effect that plagues longer styles on thinning areas. A crew cut with a low taper grows out cleanly at three to four weeks, making it one of the lowest-maintenance options on this list.</w:t>
+        <w:t xml:space="preserve">, the crew cut stands out because that front-to-back graduation builds natural lift exactly where fine hair falls flat — at the forelock. The slightly longer front gives you enough length to push up or to the side with a dab of texture paste, while the shorter crown prevents the see-through look that longer styles cause on thinning areas. A crew cut with a low taper grows out well at three to four weeks, making it one of the easiest options on this list to maintain.</w:t>
       </w:r>
     </w:p>
     <w:p>
@@ -1012,19 +939,10 @@
         <w:t xml:space="preserve">Tapered or faded sides</w:t>
       </w:r>
     </w:p>
-    <w:p/>
-    <w:p>
-      <w:pPr>
-        <w:spacing w:after="120" w:line="276"/>
-      </w:pPr>
-      <w:r>
-        <w:rPr>
-          <w:rFonts w:ascii="Georgia" w:cs="Georgia" w:eastAsia="Georgia" w:hAnsi="Georgia"/>
-          <w:sz w:val="24"/>
-          <w:szCs w:val="24"/>
-        </w:rPr>
-        <w:t xml:space="preserve"/>
-      </w:r>
+    <w:p>
+      <w:pPr>
+        <w:spacing w:after="120" w:line="276"/>
+      </w:pPr>
       <w:r>
         <w:rPr>
           <w:rFonts w:ascii="Georgia" w:cs="Georgia" w:eastAsia="Georgia" w:hAnsi="Georgia"/>
@@ -1051,14 +969,6 @@
       <w:r>
         <w:rPr>
           <w:rFonts w:ascii="Georgia" w:cs="Georgia" w:eastAsia="Georgia" w:hAnsi="Georgia"/>
-          <w:sz w:val="24"/>
-          <w:szCs w:val="24"/>
-        </w:rPr>
-        <w:t xml:space="preserve"/>
-      </w:r>
-      <w:r>
-        <w:rPr>
-          <w:rFonts w:ascii="Georgia" w:cs="Georgia" w:eastAsia="Georgia" w:hAnsi="Georgia"/>
           <w:b/>
           <w:bCs/>
           <w:sz w:val="24"/>
@@ -1075,7 +985,6 @@
         <w:t xml:space="preserve"> Straight, fine, slightly wavy</w:t>
       </w:r>
     </w:p>
-    <w:p/>
     <w:p>
       <w:pPr>
         <w:spacing w:after="120" w:line="276"/>
@@ -1205,19 +1114,10 @@
         <w:t xml:space="preserve">Clean, professional finish</w:t>
       </w:r>
     </w:p>
-    <w:p/>
-    <w:p>
-      <w:pPr>
-        <w:spacing w:after="120" w:line="276"/>
-      </w:pPr>
-      <w:r>
-        <w:rPr>
-          <w:rFonts w:ascii="Georgia" w:cs="Georgia" w:eastAsia="Georgia" w:hAnsi="Georgia"/>
-          <w:sz w:val="24"/>
-          <w:szCs w:val="24"/>
-        </w:rPr>
-        <w:t xml:space="preserve"/>
-      </w:r>
+    <w:p>
+      <w:pPr>
+        <w:spacing w:after="120" w:line="276"/>
+      </w:pPr>
       <w:r>
         <w:rPr>
           <w:rFonts w:ascii="Georgia" w:cs="Georgia" w:eastAsia="Georgia" w:hAnsi="Georgia"/>
@@ -1244,14 +1144,6 @@
       <w:r>
         <w:rPr>
           <w:rFonts w:ascii="Georgia" w:cs="Georgia" w:eastAsia="Georgia" w:hAnsi="Georgia"/>
-          <w:sz w:val="24"/>
-          <w:szCs w:val="24"/>
-        </w:rPr>
-        <w:t xml:space="preserve"/>
-      </w:r>
-      <w:r>
-        <w:rPr>
-          <w:rFonts w:ascii="Georgia" w:cs="Georgia" w:eastAsia="Georgia" w:hAnsi="Georgia"/>
           <w:b/>
           <w:bCs/>
           <w:sz w:val="24"/>
@@ -1268,18 +1160,17 @@
         <w:t xml:space="preserve"> Straight, fine, wavy</w:t>
       </w:r>
     </w:p>
-    <w:p/>
-    <w:p>
-      <w:pPr>
-        <w:spacing w:after="120" w:line="276"/>
-      </w:pPr>
-      <w:r>
-        <w:rPr>
-          <w:rFonts w:ascii="Georgia" w:cs="Georgia" w:eastAsia="Georgia" w:hAnsi="Georgia"/>
-          <w:sz w:val="24"/>
-          <w:szCs w:val="24"/>
-        </w:rPr>
-        <w:t xml:space="preserve">The Ivy League gives thin straight hair something most short cuts cannot — a side part. That part line creates visual structure, and the slightly longer top lets you sweep hair to one side, layering strands over each other so they read as denser. This is the cut I'd recommend for professional settings where a buzz cut feels too aggressive and a longer style won't hold. Use a lightweight pomade or styling cream — anything water-based that adds direction without weight. Blow-dry the part into place before applying product, lifting at the roots as you go.</w:t>
+    <w:p>
+      <w:pPr>
+        <w:spacing w:after="120" w:line="276"/>
+      </w:pPr>
+      <w:r>
+        <w:rPr>
+          <w:rFonts w:ascii="Georgia" w:cs="Georgia" w:eastAsia="Georgia" w:hAnsi="Georgia"/>
+          <w:sz w:val="24"/>
+          <w:szCs w:val="24"/>
+        </w:rPr>
+        <w:t xml:space="preserve">The Ivy League gives thin straight hair something most short cuts cannot — a side part. That part line adds visual structure, and the slightly longer top lets you sweep hair to one side, layering strands over each other for a fuller look. This is the cut I'd recommend for professional settings where a buzz cut feels too aggressive and a longer style won't hold. Use a lightweight pomade or styling cream — anything water-based that adds direction without weight. Blow-dry the part into place before applying product, lifting at the roots as you go.</w:t>
       </w:r>
     </w:p>
     <w:p>
@@ -1380,19 +1271,10 @@
         <w:t xml:space="preserve">Classic structure, sharp edges</w:t>
       </w:r>
     </w:p>
-    <w:p/>
-    <w:p>
-      <w:pPr>
-        <w:spacing w:after="120" w:line="276"/>
-      </w:pPr>
-      <w:r>
-        <w:rPr>
-          <w:rFonts w:ascii="Georgia" w:cs="Georgia" w:eastAsia="Georgia" w:hAnsi="Georgia"/>
-          <w:sz w:val="24"/>
-          <w:szCs w:val="24"/>
-        </w:rPr>
-        <w:t xml:space="preserve"/>
-      </w:r>
+    <w:p>
+      <w:pPr>
+        <w:spacing w:after="120" w:line="276"/>
+      </w:pPr>
       <w:r>
         <w:rPr>
           <w:rFonts w:ascii="Georgia" w:cs="Georgia" w:eastAsia="Georgia" w:hAnsi="Georgia"/>
@@ -1419,14 +1301,6 @@
       <w:r>
         <w:rPr>
           <w:rFonts w:ascii="Georgia" w:cs="Georgia" w:eastAsia="Georgia" w:hAnsi="Georgia"/>
-          <w:sz w:val="24"/>
-          <w:szCs w:val="24"/>
-        </w:rPr>
-        <w:t xml:space="preserve"/>
-      </w:r>
-      <w:r>
-        <w:rPr>
-          <w:rFonts w:ascii="Georgia" w:cs="Georgia" w:eastAsia="Georgia" w:hAnsi="Georgia"/>
           <w:b/>
           <w:bCs/>
           <w:sz w:val="24"/>
@@ -1443,7 +1317,6 @@
         <w:t xml:space="preserve"> Straight, fine</w:t>
       </w:r>
     </w:p>
-    <w:p/>
     <w:p>
       <w:pPr>
         <w:spacing w:after="120" w:line="276"/>
@@ -1555,19 +1428,10 @@
         <w:t xml:space="preserve">Gradual blend through the parietal ridge</w:t>
       </w:r>
     </w:p>
-    <w:p/>
-    <w:p>
-      <w:pPr>
-        <w:spacing w:after="120" w:line="276"/>
-      </w:pPr>
-      <w:r>
-        <w:rPr>
-          <w:rFonts w:ascii="Georgia" w:cs="Georgia" w:eastAsia="Georgia" w:hAnsi="Georgia"/>
-          <w:sz w:val="24"/>
-          <w:szCs w:val="24"/>
-        </w:rPr>
-        <w:t xml:space="preserve"/>
-      </w:r>
+    <w:p>
+      <w:pPr>
+        <w:spacing w:after="120" w:line="276"/>
+      </w:pPr>
       <w:r>
         <w:rPr>
           <w:rFonts w:ascii="Georgia" w:cs="Georgia" w:eastAsia="Georgia" w:hAnsi="Georgia"/>
@@ -1594,14 +1458,6 @@
       <w:r>
         <w:rPr>
           <w:rFonts w:ascii="Georgia" w:cs="Georgia" w:eastAsia="Georgia" w:hAnsi="Georgia"/>
-          <w:sz w:val="24"/>
-          <w:szCs w:val="24"/>
-        </w:rPr>
-        <w:t xml:space="preserve"/>
-      </w:r>
-      <w:r>
-        <w:rPr>
-          <w:rFonts w:ascii="Georgia" w:cs="Georgia" w:eastAsia="Georgia" w:hAnsi="Georgia"/>
           <w:b/>
           <w:bCs/>
           <w:sz w:val="24"/>
@@ -1618,7 +1474,6 @@
         <w:t xml:space="preserve"> Straight, wavy, fine</w:t>
       </w:r>
     </w:p>
-    <w:p/>
     <w:p>
       <w:pPr>
         <w:spacing w:after="120" w:line="276"/>
@@ -1766,19 +1621,10 @@
         <w:t xml:space="preserve">Fade or taper on the sides</w:t>
       </w:r>
     </w:p>
-    <w:p/>
-    <w:p>
-      <w:pPr>
-        <w:spacing w:after="120" w:line="276"/>
-      </w:pPr>
-      <w:r>
-        <w:rPr>
-          <w:rFonts w:ascii="Georgia" w:cs="Georgia" w:eastAsia="Georgia" w:hAnsi="Georgia"/>
-          <w:sz w:val="24"/>
-          <w:szCs w:val="24"/>
-        </w:rPr>
-        <w:t xml:space="preserve"/>
-      </w:r>
+    <w:p>
+      <w:pPr>
+        <w:spacing w:after="120" w:line="276"/>
+      </w:pPr>
       <w:r>
         <w:rPr>
           <w:rFonts w:ascii="Georgia" w:cs="Georgia" w:eastAsia="Georgia" w:hAnsi="Georgia"/>
@@ -1805,14 +1651,6 @@
       <w:r>
         <w:rPr>
           <w:rFonts w:ascii="Georgia" w:cs="Georgia" w:eastAsia="Georgia" w:hAnsi="Georgia"/>
-          <w:sz w:val="24"/>
-          <w:szCs w:val="24"/>
-        </w:rPr>
-        <w:t xml:space="preserve"/>
-      </w:r>
-      <w:r>
-        <w:rPr>
-          <w:rFonts w:ascii="Georgia" w:cs="Georgia" w:eastAsia="Georgia" w:hAnsi="Georgia"/>
           <w:b/>
           <w:bCs/>
           <w:sz w:val="24"/>
@@ -1829,7 +1667,6 @@
         <w:t xml:space="preserve"> Straight, fine (with product support)</w:t>
       </w:r>
     </w:p>
-    <w:p/>
     <w:p>
       <w:pPr>
         <w:spacing w:after="120" w:line="276"/>
@@ -1941,19 +1778,10 @@
         <w:t xml:space="preserve">Soft blend through the temples</w:t>
       </w:r>
     </w:p>
-    <w:p/>
-    <w:p>
-      <w:pPr>
-        <w:spacing w:after="120" w:line="276"/>
-      </w:pPr>
-      <w:r>
-        <w:rPr>
-          <w:rFonts w:ascii="Georgia" w:cs="Georgia" w:eastAsia="Georgia" w:hAnsi="Georgia"/>
-          <w:sz w:val="24"/>
-          <w:szCs w:val="24"/>
-        </w:rPr>
-        <w:t xml:space="preserve"/>
-      </w:r>
+    <w:p>
+      <w:pPr>
+        <w:spacing w:after="120" w:line="276"/>
+      </w:pPr>
       <w:r>
         <w:rPr>
           <w:rFonts w:ascii="Georgia" w:cs="Georgia" w:eastAsia="Georgia" w:hAnsi="Georgia"/>
@@ -1980,14 +1808,6 @@
       <w:r>
         <w:rPr>
           <w:rFonts w:ascii="Georgia" w:cs="Georgia" w:eastAsia="Georgia" w:hAnsi="Georgia"/>
-          <w:sz w:val="24"/>
-          <w:szCs w:val="24"/>
-        </w:rPr>
-        <w:t xml:space="preserve"/>
-      </w:r>
-      <w:r>
-        <w:rPr>
-          <w:rFonts w:ascii="Georgia" w:cs="Georgia" w:eastAsia="Georgia" w:hAnsi="Georgia"/>
           <w:b/>
           <w:bCs/>
           <w:sz w:val="24"/>
@@ -2004,7 +1824,6 @@
         <w:t xml:space="preserve"> Straight, fine, wavy</w:t>
       </w:r>
     </w:p>
-    <w:p/>
     <w:p>
       <w:pPr>
         <w:spacing w:after="120" w:line="276"/>
@@ -2033,7 +1852,7 @@
           <w:sz w:val="24"/>
           <w:szCs w:val="24"/>
         </w:rPr>
-        <w:t xml:space="preserve"> handles the sides — keeping them tight without the harshness of a skin fade — while the textured top adds the movement that thin straight hair lacks naturally. Point cutting or razor texturising the top layer creates separation between strands, which tricks the eye into seeing density. For men who want a </w:t>
+        <w:t xml:space="preserve"> handles the sides — keeping them tight without the harshness of a skin fade — while the textured top adds the movement that thin straight hair lacks naturally. Point cutting or razor texturising the top layer separates the strands, which makes fine hair look noticeably thicker. As a </w:t>
       </w:r>
       <w:r>
         <w:rPr>
@@ -2051,7 +1870,7 @@
           <w:sz w:val="24"/>
           <w:szCs w:val="24"/>
         </w:rPr>
-        <w:t xml:space="preserve"> that works in both casual and professional settings without looking extreme, the low fade with textured top hits that balance. Maintenance sits at every three to four weeks.</w:t>
+        <w:t xml:space="preserve"> that works in both casual and professional settings without looking extreme, the low fade with textured top is hard to beat. Maintenance sits at every three to four weeks.</w:t>
       </w:r>
     </w:p>
     <w:p>
@@ -2152,19 +1971,10 @@
         <w:t xml:space="preserve">Military-origin, clean structure</w:t>
       </w:r>
     </w:p>
-    <w:p/>
-    <w:p>
-      <w:pPr>
-        <w:spacing w:after="120" w:line="276"/>
-      </w:pPr>
-      <w:r>
-        <w:rPr>
-          <w:rFonts w:ascii="Georgia" w:cs="Georgia" w:eastAsia="Georgia" w:hAnsi="Georgia"/>
-          <w:sz w:val="24"/>
-          <w:szCs w:val="24"/>
-        </w:rPr>
-        <w:t xml:space="preserve"/>
-      </w:r>
+    <w:p>
+      <w:pPr>
+        <w:spacing w:after="120" w:line="276"/>
+      </w:pPr>
       <w:r>
         <w:rPr>
           <w:rFonts w:ascii="Georgia" w:cs="Georgia" w:eastAsia="Georgia" w:hAnsi="Georgia"/>
@@ -2191,14 +2001,6 @@
       <w:r>
         <w:rPr>
           <w:rFonts w:ascii="Georgia" w:cs="Georgia" w:eastAsia="Georgia" w:hAnsi="Georgia"/>
-          <w:sz w:val="24"/>
-          <w:szCs w:val="24"/>
-        </w:rPr>
-        <w:t xml:space="preserve"/>
-      </w:r>
-      <w:r>
-        <w:rPr>
-          <w:rFonts w:ascii="Georgia" w:cs="Georgia" w:eastAsia="Georgia" w:hAnsi="Georgia"/>
           <w:b/>
           <w:bCs/>
           <w:sz w:val="24"/>
@@ -2215,7 +2017,6 @@
         <w:t xml:space="preserve"> All textures</w:t>
       </w:r>
     </w:p>
-    <w:p/>
     <w:p>
       <w:pPr>
         <w:spacing w:after="120" w:line="276"/>
@@ -2244,7 +2045,7 @@
           <w:sz w:val="24"/>
           <w:szCs w:val="24"/>
         </w:rPr>
-        <w:t xml:space="preserve"> strips away everything that makes thin hair visible — length, layering, contrast. What's left is clean bone structure and a deliberate, masculine silhouette. This cut works particularly well for men with strong jawlines because the exposed sides frame the face without any hair softening the angles. On thin straight hair, the high and tight removes the guesswork entirely. No styling, no product, no bad hair days. Trim every two weeks to keep it sharp.</w:t>
+        <w:t xml:space="preserve"> removes everything that makes thin hair noticeable — length, layering, contrast. What remains is your bone structure and a sharp, masculine silhouette. This cut suits men with strong jawlines particularly well because the exposed sides frame the face without any hair softening the angles. On thin straight hair, the high and tight takes all the guesswork out. No styling, no product, no bad hair days. Trim every two weeks to keep it sharp.</w:t>
       </w:r>
     </w:p>
     <w:p>
@@ -2345,19 +2146,10 @@
         <w:t xml:space="preserve">Clean, editorial finish</w:t>
       </w:r>
     </w:p>
-    <w:p/>
-    <w:p>
-      <w:pPr>
-        <w:spacing w:after="120" w:line="276"/>
-      </w:pPr>
-      <w:r>
-        <w:rPr>
-          <w:rFonts w:ascii="Georgia" w:cs="Georgia" w:eastAsia="Georgia" w:hAnsi="Georgia"/>
-          <w:sz w:val="24"/>
-          <w:szCs w:val="24"/>
-        </w:rPr>
-        <w:t xml:space="preserve"/>
-      </w:r>
+    <w:p>
+      <w:pPr>
+        <w:spacing w:after="120" w:line="276"/>
+      </w:pPr>
       <w:r>
         <w:rPr>
           <w:rFonts w:ascii="Georgia" w:cs="Georgia" w:eastAsia="Georgia" w:hAnsi="Georgia"/>
@@ -2384,14 +2176,6 @@
       <w:r>
         <w:rPr>
           <w:rFonts w:ascii="Georgia" w:cs="Georgia" w:eastAsia="Georgia" w:hAnsi="Georgia"/>
-          <w:sz w:val="24"/>
-          <w:szCs w:val="24"/>
-        </w:rPr>
-        <w:t xml:space="preserve"/>
-      </w:r>
-      <w:r>
-        <w:rPr>
-          <w:rFonts w:ascii="Georgia" w:cs="Georgia" w:eastAsia="Georgia" w:hAnsi="Georgia"/>
           <w:b/>
           <w:bCs/>
           <w:sz w:val="24"/>
@@ -2408,18 +2192,17 @@
         <w:t xml:space="preserve"> Straight (natural advantage for slicking)</w:t>
       </w:r>
     </w:p>
-    <w:p/>
-    <w:p>
-      <w:pPr>
-        <w:spacing w:after="120" w:line="276"/>
-      </w:pPr>
-      <w:r>
-        <w:rPr>
-          <w:rFonts w:ascii="Georgia" w:cs="Georgia" w:eastAsia="Georgia" w:hAnsi="Georgia"/>
-          <w:sz w:val="24"/>
-          <w:szCs w:val="24"/>
-        </w:rPr>
-        <w:t xml:space="preserve">Thin straight hair has one genuine advantage over every other texture — it slicks back without resistance. Where thick or curly hair fights a slicked-back style, fine straight strands lie flat and smooth with minimal product. The undercut creates enough contrast that the top reads as intentionally sleek rather than just flat. The catch: this only works when thin hair still has reasonable density across the top. If the scalp shows through when hair is pulled back, move to a shorter option. Use a water-based pomade — oil-based formulas weigh thin hair down and separate strands.</w:t>
+    <w:p>
+      <w:pPr>
+        <w:spacing w:after="120" w:line="276"/>
+      </w:pPr>
+      <w:r>
+        <w:rPr>
+          <w:rFonts w:ascii="Georgia" w:cs="Georgia" w:eastAsia="Georgia" w:hAnsi="Georgia"/>
+          <w:sz w:val="24"/>
+          <w:szCs w:val="24"/>
+        </w:rPr>
+        <w:t xml:space="preserve">Thin straight hair has one genuine advantage over every other texture — it slicks back without resistance. Where thick or curly hair fights a slicked-back style, fine straight strands lie flat and smooth with minimal product. The undercut adds enough contrast that the top looks intentionally sleek rather than just flat. The catch: this only works when thin hair still has reasonable density across the top. If the scalp shows through when hair is pulled back, move to a shorter option. Use a water-based pomade — oil-based formulas weigh thin hair down and separate strands.</w:t>
       </w:r>
     </w:p>
     <w:p>
@@ -2520,19 +2303,10 @@
         <w:t xml:space="preserve">Tapered or faded sides</w:t>
       </w:r>
     </w:p>
-    <w:p/>
-    <w:p>
-      <w:pPr>
-        <w:spacing w:after="120" w:line="276"/>
-      </w:pPr>
-      <w:r>
-        <w:rPr>
-          <w:rFonts w:ascii="Georgia" w:cs="Georgia" w:eastAsia="Georgia" w:hAnsi="Georgia"/>
-          <w:sz w:val="24"/>
-          <w:szCs w:val="24"/>
-        </w:rPr>
-        <w:t xml:space="preserve"/>
-      </w:r>
+    <w:p>
+      <w:pPr>
+        <w:spacing w:after="120" w:line="276"/>
+      </w:pPr>
       <w:r>
         <w:rPr>
           <w:rFonts w:ascii="Georgia" w:cs="Georgia" w:eastAsia="Georgia" w:hAnsi="Georgia"/>
@@ -2559,14 +2333,6 @@
       <w:r>
         <w:rPr>
           <w:rFonts w:ascii="Georgia" w:cs="Georgia" w:eastAsia="Georgia" w:hAnsi="Georgia"/>
-          <w:sz w:val="24"/>
-          <w:szCs w:val="24"/>
-        </w:rPr>
-        <w:t xml:space="preserve"/>
-      </w:r>
-      <w:r>
-        <w:rPr>
-          <w:rFonts w:ascii="Georgia" w:cs="Georgia" w:eastAsia="Georgia" w:hAnsi="Georgia"/>
           <w:b/>
           <w:bCs/>
           <w:sz w:val="24"/>
@@ -2583,7 +2349,6 @@
         <w:t xml:space="preserve"> Straight, fine</w:t>
       </w:r>
     </w:p>
-    <w:p/>
     <w:p>
       <w:pPr>
         <w:spacing w:after="120" w:line="276"/>
@@ -2695,19 +2460,10 @@
         <w:t xml:space="preserve">Faded or tapered sides</w:t>
       </w:r>
     </w:p>
-    <w:p/>
-    <w:p>
-      <w:pPr>
-        <w:spacing w:after="120" w:line="276"/>
-      </w:pPr>
-      <w:r>
-        <w:rPr>
-          <w:rFonts w:ascii="Georgia" w:cs="Georgia" w:eastAsia="Georgia" w:hAnsi="Georgia"/>
-          <w:sz w:val="24"/>
-          <w:szCs w:val="24"/>
-        </w:rPr>
-        <w:t xml:space="preserve"/>
-      </w:r>
+    <w:p>
+      <w:pPr>
+        <w:spacing w:after="120" w:line="276"/>
+      </w:pPr>
       <w:r>
         <w:rPr>
           <w:rFonts w:ascii="Georgia" w:cs="Georgia" w:eastAsia="Georgia" w:hAnsi="Georgia"/>
@@ -2734,14 +2490,6 @@
       <w:r>
         <w:rPr>
           <w:rFonts w:ascii="Georgia" w:cs="Georgia" w:eastAsia="Georgia" w:hAnsi="Georgia"/>
-          <w:sz w:val="24"/>
-          <w:szCs w:val="24"/>
-        </w:rPr>
-        <w:t xml:space="preserve"/>
-      </w:r>
-      <w:r>
-        <w:rPr>
-          <w:rFonts w:ascii="Georgia" w:cs="Georgia" w:eastAsia="Georgia" w:hAnsi="Georgia"/>
           <w:b/>
           <w:bCs/>
           <w:sz w:val="24"/>
@@ -2758,7 +2506,6 @@
         <w:t xml:space="preserve"> Straight, fine (with blow-dry support)</w:t>
       </w:r>
     </w:p>
-    <w:p/>
     <w:p>
       <w:pPr>
         <w:spacing w:after="120" w:line="276"/>
@@ -2870,19 +2617,10 @@
         <w:t xml:space="preserve">High fade or undercut on the sides</w:t>
       </w:r>
     </w:p>
-    <w:p/>
-    <w:p>
-      <w:pPr>
-        <w:spacing w:after="120" w:line="276"/>
-      </w:pPr>
-      <w:r>
-        <w:rPr>
-          <w:rFonts w:ascii="Georgia" w:cs="Georgia" w:eastAsia="Georgia" w:hAnsi="Georgia"/>
-          <w:sz w:val="24"/>
-          <w:szCs w:val="24"/>
-        </w:rPr>
-        <w:t xml:space="preserve"/>
-      </w:r>
+    <w:p>
+      <w:pPr>
+        <w:spacing w:after="120" w:line="276"/>
+      </w:pPr>
       <w:r>
         <w:rPr>
           <w:rFonts w:ascii="Georgia" w:cs="Georgia" w:eastAsia="Georgia" w:hAnsi="Georgia"/>
@@ -2909,14 +2647,6 @@
       <w:r>
         <w:rPr>
           <w:rFonts w:ascii="Georgia" w:cs="Georgia" w:eastAsia="Georgia" w:hAnsi="Georgia"/>
-          <w:sz w:val="24"/>
-          <w:szCs w:val="24"/>
-        </w:rPr>
-        <w:t xml:space="preserve"/>
-      </w:r>
-      <w:r>
-        <w:rPr>
-          <w:rFonts w:ascii="Georgia" w:cs="Georgia" w:eastAsia="Georgia" w:hAnsi="Georgia"/>
           <w:b/>
           <w:bCs/>
           <w:sz w:val="24"/>
@@ -2933,7 +2663,6 @@
         <w:t xml:space="preserve"> Straight, fine, wavy</w:t>
       </w:r>
     </w:p>
-    <w:p/>
     <w:p>
       <w:pPr>
         <w:spacing w:after="120" w:line="276"/>
@@ -3045,19 +2774,10 @@
         <w:t xml:space="preserve">Tapered rather than shaved edges for a professional look</w:t>
       </w:r>
     </w:p>
-    <w:p/>
-    <w:p>
-      <w:pPr>
-        <w:spacing w:after="120" w:line="276"/>
-      </w:pPr>
-      <w:r>
-        <w:rPr>
-          <w:rFonts w:ascii="Georgia" w:cs="Georgia" w:eastAsia="Georgia" w:hAnsi="Georgia"/>
-          <w:sz w:val="24"/>
-          <w:szCs w:val="24"/>
-        </w:rPr>
-        <w:t xml:space="preserve"/>
-      </w:r>
+    <w:p>
+      <w:pPr>
+        <w:spacing w:after="120" w:line="276"/>
+      </w:pPr>
       <w:r>
         <w:rPr>
           <w:rFonts w:ascii="Georgia" w:cs="Georgia" w:eastAsia="Georgia" w:hAnsi="Georgia"/>
@@ -3084,14 +2804,6 @@
       <w:r>
         <w:rPr>
           <w:rFonts w:ascii="Georgia" w:cs="Georgia" w:eastAsia="Georgia" w:hAnsi="Georgia"/>
-          <w:sz w:val="24"/>
-          <w:szCs w:val="24"/>
-        </w:rPr>
-        <w:t xml:space="preserve"/>
-      </w:r>
-      <w:r>
-        <w:rPr>
-          <w:rFonts w:ascii="Georgia" w:cs="Georgia" w:eastAsia="Georgia" w:hAnsi="Georgia"/>
           <w:b/>
           <w:bCs/>
           <w:sz w:val="24"/>
@@ -3108,18 +2820,17 @@
         <w:t xml:space="preserve"> Straight, fine, wavy</w:t>
       </w:r>
     </w:p>
-    <w:p/>
-    <w:p>
-      <w:pPr>
-        <w:spacing w:after="120" w:line="276"/>
-      </w:pPr>
-      <w:r>
-        <w:rPr>
-          <w:rFonts w:ascii="Georgia" w:cs="Georgia" w:eastAsia="Georgia" w:hAnsi="Georgia"/>
-          <w:sz w:val="24"/>
-          <w:szCs w:val="24"/>
-        </w:rPr>
-        <w:t xml:space="preserve">The faux hawk concentrates all available hair into a central ridge, which makes thin straight hair look deliberately styled rather than sparse. The fade on both sides creates a clean frame, and the longer centre strip has enough volume to push upward with a blow-dryer and clay. This works best on men with even thinning across the top — the central gathering disguises uniform density loss better than side-parted styles do. Keep the centre strip under two inches for fine hair; anything longer falls sideways.</w:t>
+    <w:p>
+      <w:pPr>
+        <w:spacing w:after="120" w:line="276"/>
+      </w:pPr>
+      <w:r>
+        <w:rPr>
+          <w:rFonts w:ascii="Georgia" w:cs="Georgia" w:eastAsia="Georgia" w:hAnsi="Georgia"/>
+          <w:sz w:val="24"/>
+          <w:szCs w:val="24"/>
+        </w:rPr>
+        <w:t xml:space="preserve">The faux hawk concentrates all available hair into a central ridge, giving thin straight hair a styled, intentional shape rather than a flat one. The fade on both sides creates a clean frame, and the longer centre strip has enough volume to push upward with a blow-dryer and clay. This works best on men with even thinning across the top — the central gathering disguises uniform density loss better than side-parted styles do. Keep the centre strip under two inches for fine hair; anything longer falls sideways.</w:t>
       </w:r>
     </w:p>
     <w:p>
@@ -3220,19 +2931,10 @@
         <w:t xml:space="preserve">Hard line at the disconnect point</w:t>
       </w:r>
     </w:p>
-    <w:p/>
-    <w:p>
-      <w:pPr>
-        <w:spacing w:after="120" w:line="276"/>
-      </w:pPr>
-      <w:r>
-        <w:rPr>
-          <w:rFonts w:ascii="Georgia" w:cs="Georgia" w:eastAsia="Georgia" w:hAnsi="Georgia"/>
-          <w:sz w:val="24"/>
-          <w:szCs w:val="24"/>
-        </w:rPr>
-        <w:t xml:space="preserve"/>
-      </w:r>
+    <w:p>
+      <w:pPr>
+        <w:spacing w:after="120" w:line="276"/>
+      </w:pPr>
       <w:r>
         <w:rPr>
           <w:rFonts w:ascii="Georgia" w:cs="Georgia" w:eastAsia="Georgia" w:hAnsi="Georgia"/>
@@ -3259,14 +2961,6 @@
       <w:r>
         <w:rPr>
           <w:rFonts w:ascii="Georgia" w:cs="Georgia" w:eastAsia="Georgia" w:hAnsi="Georgia"/>
-          <w:sz w:val="24"/>
-          <w:szCs w:val="24"/>
-        </w:rPr>
-        <w:t xml:space="preserve"/>
-      </w:r>
-      <w:r>
-        <w:rPr>
-          <w:rFonts w:ascii="Georgia" w:cs="Georgia" w:eastAsia="Georgia" w:hAnsi="Georgia"/>
           <w:b/>
           <w:bCs/>
           <w:sz w:val="24"/>
@@ -3283,18 +2977,17 @@
         <w:t xml:space="preserve"> Straight, fine</w:t>
       </w:r>
     </w:p>
-    <w:p/>
-    <w:p>
-      <w:pPr>
-        <w:spacing w:after="120" w:line="276"/>
-      </w:pPr>
-      <w:r>
-        <w:rPr>
-          <w:rFonts w:ascii="Georgia" w:cs="Georgia" w:eastAsia="Georgia" w:hAnsi="Georgia"/>
-          <w:sz w:val="24"/>
-          <w:szCs w:val="24"/>
-        </w:rPr>
-        <w:t xml:space="preserve">The disconnected undercut works on thin straight hair when the top still has enough density to cover the scalp when styled. The hard disconnect line creates a deliberate, graphic look that signals intention — no one mistakes this for thinning. Straight hair falls cleanly over the disconnect, which is an advantage curly-haired men don't get. Style the top forward, to the side, or slicked back depending on face shape. For thin straight hair specifically, I'd recommend styling forward — it covers the most scalp area with the least hair.</w:t>
+    <w:p>
+      <w:pPr>
+        <w:spacing w:after="120" w:line="276"/>
+      </w:pPr>
+      <w:r>
+        <w:rPr>
+          <w:rFonts w:ascii="Georgia" w:cs="Georgia" w:eastAsia="Georgia" w:hAnsi="Georgia"/>
+          <w:sz w:val="24"/>
+          <w:szCs w:val="24"/>
+        </w:rPr>
+        <w:t xml:space="preserve">The disconnected undercut works on thin straight hair when the top still has enough density to cover the scalp when styled. The hard disconnect line creates a bold, graphic look — no one mistakes this for thinning. Straight hair falls cleanly over the disconnect, which is an advantage curly-haired men don't get. Style the top forward, to the side, or slicked back depending on face shape. For thin straight hair specifically, I'd recommend styling forward — it covers the most scalp area with the least hair.</w:t>
       </w:r>
     </w:p>
     <w:p>
@@ -3395,19 +3088,10 @@
         <w:t xml:space="preserve">Two to three inches on top, natural at the crown</w:t>
       </w:r>
     </w:p>
-    <w:p/>
-    <w:p>
-      <w:pPr>
-        <w:spacing w:after="120" w:line="276"/>
-      </w:pPr>
-      <w:r>
-        <w:rPr>
-          <w:rFonts w:ascii="Georgia" w:cs="Georgia" w:eastAsia="Georgia" w:hAnsi="Georgia"/>
-          <w:sz w:val="24"/>
-          <w:szCs w:val="24"/>
-        </w:rPr>
-        <w:t xml:space="preserve"/>
-      </w:r>
+    <w:p>
+      <w:pPr>
+        <w:spacing w:after="120" w:line="276"/>
+      </w:pPr>
       <w:r>
         <w:rPr>
           <w:rFonts w:ascii="Georgia" w:cs="Georgia" w:eastAsia="Georgia" w:hAnsi="Georgia"/>
@@ -3434,14 +3118,6 @@
       <w:r>
         <w:rPr>
           <w:rFonts w:ascii="Georgia" w:cs="Georgia" w:eastAsia="Georgia" w:hAnsi="Georgia"/>
-          <w:sz w:val="24"/>
-          <w:szCs w:val="24"/>
-        </w:rPr>
-        <w:t xml:space="preserve"/>
-      </w:r>
-      <w:r>
-        <w:rPr>
-          <w:rFonts w:ascii="Georgia" w:cs="Georgia" w:eastAsia="Georgia" w:hAnsi="Georgia"/>
           <w:b/>
           <w:bCs/>
           <w:sz w:val="24"/>
@@ -3458,7 +3134,6 @@
         <w:t xml:space="preserve"> Straight, wavy, fine</w:t>
       </w:r>
     </w:p>
-    <w:p/>
     <w:p>
       <w:pPr>
         <w:spacing w:after="120" w:line="276"/>
@@ -3588,19 +3263,10 @@
         <w:t xml:space="preserve">Clean, sharp finish</w:t>
       </w:r>
     </w:p>
-    <w:p/>
-    <w:p>
-      <w:pPr>
-        <w:spacing w:after="120" w:line="276"/>
-      </w:pPr>
-      <w:r>
-        <w:rPr>
-          <w:rFonts w:ascii="Georgia" w:cs="Georgia" w:eastAsia="Georgia" w:hAnsi="Georgia"/>
-          <w:sz w:val="24"/>
-          <w:szCs w:val="24"/>
-        </w:rPr>
-        <w:t xml:space="preserve"/>
-      </w:r>
+    <w:p>
+      <w:pPr>
+        <w:spacing w:after="120" w:line="276"/>
+      </w:pPr>
       <w:r>
         <w:rPr>
           <w:rFonts w:ascii="Georgia" w:cs="Georgia" w:eastAsia="Georgia" w:hAnsi="Georgia"/>
@@ -3627,14 +3293,6 @@
       <w:r>
         <w:rPr>
           <w:rFonts w:ascii="Georgia" w:cs="Georgia" w:eastAsia="Georgia" w:hAnsi="Georgia"/>
-          <w:sz w:val="24"/>
-          <w:szCs w:val="24"/>
-        </w:rPr>
-        <w:t xml:space="preserve"/>
-      </w:r>
-      <w:r>
-        <w:rPr>
-          <w:rFonts w:ascii="Georgia" w:cs="Georgia" w:eastAsia="Georgia" w:hAnsi="Georgia"/>
           <w:b/>
           <w:bCs/>
           <w:sz w:val="24"/>
@@ -3651,18 +3309,17 @@
         <w:t xml:space="preserve"> Straight, fine, wavy</w:t>
       </w:r>
     </w:p>
-    <w:p/>
-    <w:p>
-      <w:pPr>
-        <w:spacing w:after="120" w:line="276"/>
-      </w:pPr>
-      <w:r>
-        <w:rPr>
-          <w:rFonts w:ascii="Georgia" w:cs="Georgia" w:eastAsia="Georgia" w:hAnsi="Georgia"/>
-          <w:sz w:val="24"/>
-          <w:szCs w:val="24"/>
-        </w:rPr>
-        <w:t xml:space="preserve">The skin fade crop takes the textured crop and pushes the contrast higher. By fading to skin at the temples, the sides disappear entirely — all visual weight concentrates on the textured top. On thin straight hair, this concentration effect makes the top look significantly fuller than it actually is. The trade-off is maintenance: a skin fade grows out noticeably within ten days, so you're looking at fortnightly trims to keep it sharp. Worth it for men who want maximum impact from minimal hair.</w:t>
+    <w:p>
+      <w:pPr>
+        <w:spacing w:after="120" w:line="276"/>
+      </w:pPr>
+      <w:r>
+        <w:rPr>
+          <w:rFonts w:ascii="Georgia" w:cs="Georgia" w:eastAsia="Georgia" w:hAnsi="Georgia"/>
+          <w:sz w:val="24"/>
+          <w:szCs w:val="24"/>
+        </w:rPr>
+        <w:t xml:space="preserve">The skin fade crop takes the textured crop and pushes the contrast higher. By fading to skin at the temples, the sides disappear entirely — all visual weight concentrates on the textured top. On thin straight hair, that concentrated weight makes the top look noticeably fuller. The trade-off is maintenance: a skin fade grows out noticeably within ten days, so you're looking at fortnightly trims to keep it sharp. Worth it for men who want maximum impact from minimal hair.</w:t>
       </w:r>
     </w:p>
     <w:p>
@@ -3763,19 +3420,10 @@
         <w:t xml:space="preserve">Versatile — can be styled in multiple directions</w:t>
       </w:r>
     </w:p>
-    <w:p/>
-    <w:p>
-      <w:pPr>
-        <w:spacing w:after="120" w:line="276"/>
-      </w:pPr>
-      <w:r>
-        <w:rPr>
-          <w:rFonts w:ascii="Georgia" w:cs="Georgia" w:eastAsia="Georgia" w:hAnsi="Georgia"/>
-          <w:sz w:val="24"/>
-          <w:szCs w:val="24"/>
-        </w:rPr>
-        <w:t xml:space="preserve"/>
-      </w:r>
+    <w:p>
+      <w:pPr>
+        <w:spacing w:after="120" w:line="276"/>
+      </w:pPr>
       <w:r>
         <w:rPr>
           <w:rFonts w:ascii="Georgia" w:cs="Georgia" w:eastAsia="Georgia" w:hAnsi="Georgia"/>
@@ -3802,14 +3450,6 @@
       <w:r>
         <w:rPr>
           <w:rFonts w:ascii="Georgia" w:cs="Georgia" w:eastAsia="Georgia" w:hAnsi="Georgia"/>
-          <w:sz w:val="24"/>
-          <w:szCs w:val="24"/>
-        </w:rPr>
-        <w:t xml:space="preserve"/>
-      </w:r>
-      <w:r>
-        <w:rPr>
-          <w:rFonts w:ascii="Georgia" w:cs="Georgia" w:eastAsia="Georgia" w:hAnsi="Georgia"/>
           <w:b/>
           <w:bCs/>
           <w:sz w:val="24"/>
@@ -3826,18 +3466,17 @@
         <w:t xml:space="preserve"> All textures</w:t>
       </w:r>
     </w:p>
-    <w:p/>
-    <w:p>
-      <w:pPr>
-        <w:spacing w:after="120" w:line="276"/>
-      </w:pPr>
-      <w:r>
-        <w:rPr>
-          <w:rFonts w:ascii="Georgia" w:cs="Georgia" w:eastAsia="Georgia" w:hAnsi="Georgia"/>
-          <w:sz w:val="24"/>
-          <w:szCs w:val="24"/>
-        </w:rPr>
-        <w:t xml:space="preserve">The short back and sides is the baseline every other cut on this list modifies. For men with thin straight hair who don't want anything trend-driven, this classic delivers a clean, proportioned look that works from the boardroom to the weekend. The shorter sides create enough contrast that the longer top — even with reduced density — looks intentional. Style it however the day demands: parted, pushed back, textured forward. This is the </w:t>
+    <w:p>
+      <w:pPr>
+        <w:spacing w:after="120" w:line="276"/>
+      </w:pPr>
+      <w:r>
+        <w:rPr>
+          <w:rFonts w:ascii="Georgia" w:cs="Georgia" w:eastAsia="Georgia" w:hAnsi="Georgia"/>
+          <w:sz w:val="24"/>
+          <w:szCs w:val="24"/>
+        </w:rPr>
+        <w:t xml:space="preserve">The short back and sides is the baseline every other cut on this list modifies. For men with thin straight hair who don't want anything trend-driven, this classic delivers a clean, proportioned look that works from the boardroom to the weekend. The shorter sides frame the longer top so it looks purposeful, even with reduced density. Style it however the day demands: parted, pushed back, textured forward. This is the </w:t>
       </w:r>
       <w:r>
         <w:rPr>
@@ -3956,19 +3595,10 @@
         <w:t xml:space="preserve">Relaxed, natural movement</w:t>
       </w:r>
     </w:p>
-    <w:p/>
-    <w:p>
-      <w:pPr>
-        <w:spacing w:after="120" w:line="276"/>
-      </w:pPr>
-      <w:r>
-        <w:rPr>
-          <w:rFonts w:ascii="Georgia" w:cs="Georgia" w:eastAsia="Georgia" w:hAnsi="Georgia"/>
-          <w:sz w:val="24"/>
-          <w:szCs w:val="24"/>
-        </w:rPr>
-        <w:t xml:space="preserve"/>
-      </w:r>
+    <w:p>
+      <w:pPr>
+        <w:spacing w:after="120" w:line="276"/>
+      </w:pPr>
       <w:r>
         <w:rPr>
           <w:rFonts w:ascii="Georgia" w:cs="Georgia" w:eastAsia="Georgia" w:hAnsi="Georgia"/>
@@ -3995,14 +3625,6 @@
       <w:r>
         <w:rPr>
           <w:rFonts w:ascii="Georgia" w:cs="Georgia" w:eastAsia="Georgia" w:hAnsi="Georgia"/>
-          <w:sz w:val="24"/>
-          <w:szCs w:val="24"/>
-        </w:rPr>
-        <w:t xml:space="preserve"/>
-      </w:r>
-      <w:r>
-        <w:rPr>
-          <w:rFonts w:ascii="Georgia" w:cs="Georgia" w:eastAsia="Georgia" w:hAnsi="Georgia"/>
           <w:b/>
           <w:bCs/>
           <w:sz w:val="24"/>
@@ -4019,18 +3641,17 @@
         <w:t xml:space="preserve"> Straight, fine</w:t>
       </w:r>
     </w:p>
-    <w:p/>
-    <w:p>
-      <w:pPr>
-        <w:spacing w:after="120" w:line="276"/>
-      </w:pPr>
-      <w:r>
-        <w:rPr>
-          <w:rFonts w:ascii="Georgia" w:cs="Georgia" w:eastAsia="Georgia" w:hAnsi="Georgia"/>
-          <w:sz w:val="24"/>
-          <w:szCs w:val="24"/>
-        </w:rPr>
-        <w:t xml:space="preserve">The side sweep works on thin straight hair because the directional movement layers strands over each other, creating depth that straight-down styles cannot. Adding texture through point cutting or razor work breaks the flat surface into individual pieces that catch light at different angles — the visual trick that makes thin hair appear thicker. Style by blow-drying to one side from damp, then running a small amount of texture cream through the mid-lengths. The roots should stay product-free for maximum lift.</w:t>
+    <w:p>
+      <w:pPr>
+        <w:spacing w:after="120" w:line="276"/>
+      </w:pPr>
+      <w:r>
+        <w:rPr>
+          <w:rFonts w:ascii="Georgia" w:cs="Georgia" w:eastAsia="Georgia" w:hAnsi="Georgia"/>
+          <w:sz w:val="24"/>
+          <w:szCs w:val="24"/>
+        </w:rPr>
+        <w:t xml:space="preserve">The side sweep works on thin straight hair because the directional movement layers strands over each other, creating depth that straight-down styles cannot. Point cutting or razor work through the top breaks the flat surface into individual pieces that catch light differently — fine hair immediately looks thicker when it's not lying in one uniform sheet. Style by blow-drying to one side from damp, then running a small amount of texture cream through the mid-lengths. The roots should stay product-free for maximum lift.</w:t>
       </w:r>
     </w:p>
     <w:p>
@@ -4131,19 +3752,10 @@
         <w:t xml:space="preserve">Line-up at the hairline for definition</w:t>
       </w:r>
     </w:p>
-    <w:p/>
-    <w:p>
-      <w:pPr>
-        <w:spacing w:after="120" w:line="276"/>
-      </w:pPr>
-      <w:r>
-        <w:rPr>
-          <w:rFonts w:ascii="Georgia" w:cs="Georgia" w:eastAsia="Georgia" w:hAnsi="Georgia"/>
-          <w:sz w:val="24"/>
-          <w:szCs w:val="24"/>
-        </w:rPr>
-        <w:t xml:space="preserve"/>
-      </w:r>
+    <w:p>
+      <w:pPr>
+        <w:spacing w:after="120" w:line="276"/>
+      </w:pPr>
       <w:r>
         <w:rPr>
           <w:rFonts w:ascii="Georgia" w:cs="Georgia" w:eastAsia="Georgia" w:hAnsi="Georgia"/>
@@ -4170,14 +3782,6 @@
       <w:r>
         <w:rPr>
           <w:rFonts w:ascii="Georgia" w:cs="Georgia" w:eastAsia="Georgia" w:hAnsi="Georgia"/>
-          <w:sz w:val="24"/>
-          <w:szCs w:val="24"/>
-        </w:rPr>
-        <w:t xml:space="preserve"/>
-      </w:r>
-      <w:r>
-        <w:rPr>
-          <w:rFonts w:ascii="Georgia" w:cs="Georgia" w:eastAsia="Georgia" w:hAnsi="Georgia"/>
           <w:b/>
           <w:bCs/>
           <w:sz w:val="24"/>
@@ -4194,7 +3798,6 @@
         <w:t xml:space="preserve"> All textures</w:t>
       </w:r>
     </w:p>
-    <w:p/>
     <w:p>
       <w:pPr>
         <w:spacing w:after="120" w:line="276"/>
@@ -4223,7 +3826,7 @@
           <w:sz w:val="24"/>
           <w:szCs w:val="24"/>
         </w:rPr>
-        <w:t xml:space="preserve">, the crisp line-up redefines where the hairline sits — your barber can place that edge wherever it looks most balanced. On thin straight hair, the combination of a #3 top with a skin fade reads as intentional minimalism rather than thinning. Nicholas Hoult and other actors with fine hair have worn variations of this cut successfully.</w:t>
+        <w:t xml:space="preserve">, the crisp line-up redefines where the hairline sits — your barber can place that edge wherever it looks most balanced. On thin straight hair, a #3 top with a skin fade looks like a style choice, not a thinning problem. Nicholas Hoult and other actors with fine hair have worn variations of this cut successfully.</w:t>
       </w:r>
     </w:p>
     <w:p>
@@ -4324,19 +3927,10 @@
         <w:t xml:space="preserve">Gradual taper on the sides</w:t>
       </w:r>
     </w:p>
-    <w:p/>
-    <w:p>
-      <w:pPr>
-        <w:spacing w:after="120" w:line="276"/>
-      </w:pPr>
-      <w:r>
-        <w:rPr>
-          <w:rFonts w:ascii="Georgia" w:cs="Georgia" w:eastAsia="Georgia" w:hAnsi="Georgia"/>
-          <w:sz w:val="24"/>
-          <w:szCs w:val="24"/>
-        </w:rPr>
-        <w:t xml:space="preserve"/>
-      </w:r>
+    <w:p>
+      <w:pPr>
+        <w:spacing w:after="120" w:line="276"/>
+      </w:pPr>
       <w:r>
         <w:rPr>
           <w:rFonts w:ascii="Georgia" w:cs="Georgia" w:eastAsia="Georgia" w:hAnsi="Georgia"/>
@@ -4363,14 +3957,6 @@
       <w:r>
         <w:rPr>
           <w:rFonts w:ascii="Georgia" w:cs="Georgia" w:eastAsia="Georgia" w:hAnsi="Georgia"/>
-          <w:sz w:val="24"/>
-          <w:szCs w:val="24"/>
-        </w:rPr>
-        <w:t xml:space="preserve"/>
-      </w:r>
-      <w:r>
-        <w:rPr>
-          <w:rFonts w:ascii="Georgia" w:cs="Georgia" w:eastAsia="Georgia" w:hAnsi="Georgia"/>
           <w:b/>
           <w:bCs/>
           <w:sz w:val="24"/>
@@ -4387,7 +3973,6 @@
         <w:t xml:space="preserve"> Straight, fine</w:t>
       </w:r>
     </w:p>
-    <w:p/>
     <w:p>
       <w:pPr>
         <w:spacing w:after="120" w:line="276"/>
@@ -4517,19 +4102,10 @@
         <w:t xml:space="preserve">Blended transition through the crown</w:t>
       </w:r>
     </w:p>
-    <w:p/>
-    <w:p>
-      <w:pPr>
-        <w:spacing w:after="120" w:line="276"/>
-      </w:pPr>
-      <w:r>
-        <w:rPr>
-          <w:rFonts w:ascii="Georgia" w:cs="Georgia" w:eastAsia="Georgia" w:hAnsi="Georgia"/>
-          <w:sz w:val="24"/>
-          <w:szCs w:val="24"/>
-        </w:rPr>
-        <w:t xml:space="preserve"/>
-      </w:r>
+    <w:p>
+      <w:pPr>
+        <w:spacing w:after="120" w:line="276"/>
+      </w:pPr>
       <w:r>
         <w:rPr>
           <w:rFonts w:ascii="Georgia" w:cs="Georgia" w:eastAsia="Georgia" w:hAnsi="Georgia"/>
@@ -4556,14 +4132,6 @@
       <w:r>
         <w:rPr>
           <w:rFonts w:ascii="Georgia" w:cs="Georgia" w:eastAsia="Georgia" w:hAnsi="Georgia"/>
-          <w:sz w:val="24"/>
-          <w:szCs w:val="24"/>
-        </w:rPr>
-        <w:t xml:space="preserve"/>
-      </w:r>
-      <w:r>
-        <w:rPr>
-          <w:rFonts w:ascii="Georgia" w:cs="Georgia" w:eastAsia="Georgia" w:hAnsi="Georgia"/>
           <w:b/>
           <w:bCs/>
           <w:sz w:val="24"/>
@@ -4580,7 +4148,6 @@
         <w:t xml:space="preserve"> Straight, fine, slightly wavy</w:t>
       </w:r>
     </w:p>
-    <w:p/>
     <w:p>
       <w:pPr>
         <w:spacing w:after="120" w:line="276"/>
@@ -4692,19 +4259,10 @@
         <w:t xml:space="preserve">Low fade from the ear down</w:t>
       </w:r>
     </w:p>
-    <w:p/>
-    <w:p>
-      <w:pPr>
-        <w:spacing w:after="120" w:line="276"/>
-      </w:pPr>
-      <w:r>
-        <w:rPr>
-          <w:rFonts w:ascii="Georgia" w:cs="Georgia" w:eastAsia="Georgia" w:hAnsi="Georgia"/>
-          <w:sz w:val="24"/>
-          <w:szCs w:val="24"/>
-        </w:rPr>
-        <w:t xml:space="preserve"/>
-      </w:r>
+    <w:p>
+      <w:pPr>
+        <w:spacing w:after="120" w:line="276"/>
+      </w:pPr>
       <w:r>
         <w:rPr>
           <w:rFonts w:ascii="Georgia" w:cs="Georgia" w:eastAsia="Georgia" w:hAnsi="Georgia"/>
@@ -4731,14 +4289,6 @@
       <w:r>
         <w:rPr>
           <w:rFonts w:ascii="Georgia" w:cs="Georgia" w:eastAsia="Georgia" w:hAnsi="Georgia"/>
-          <w:sz w:val="24"/>
-          <w:szCs w:val="24"/>
-        </w:rPr>
-        <w:t xml:space="preserve"/>
-      </w:r>
-      <w:r>
-        <w:rPr>
-          <w:rFonts w:ascii="Georgia" w:cs="Georgia" w:eastAsia="Georgia" w:hAnsi="Georgia"/>
           <w:b/>
           <w:bCs/>
           <w:sz w:val="24"/>
@@ -4755,18 +4305,17 @@
         <w:t xml:space="preserve"> Straight, fine, wavy</w:t>
       </w:r>
     </w:p>
-    <w:p/>
-    <w:p>
-      <w:pPr>
-        <w:spacing w:after="120" w:line="276"/>
-      </w:pPr>
-      <w:r>
-        <w:rPr>
-          <w:rFonts w:ascii="Georgia" w:cs="Georgia" w:eastAsia="Georgia" w:hAnsi="Georgia"/>
-          <w:sz w:val="24"/>
-          <w:szCs w:val="24"/>
-        </w:rPr>
-        <w:t xml:space="preserve">The messy textured top turns thin hair's biggest weakness — lack of structure — into a deliberate style choice. By texturising the top and styling it with a sea salt spray or matte clay into a tousled finish, the hair looks like it was styled to be imperfect rather than falling flat on its own. The low fade keeps the bottom half clean so the messiness on top reads as intentional. For men who want an effortless look without the careful precision of a side part or quiff, this is the least-effort style that still looks considered.</w:t>
+    <w:p>
+      <w:pPr>
+        <w:spacing w:after="120" w:line="276"/>
+      </w:pPr>
+      <w:r>
+        <w:rPr>
+          <w:rFonts w:ascii="Georgia" w:cs="Georgia" w:eastAsia="Georgia" w:hAnsi="Georgia"/>
+          <w:sz w:val="24"/>
+          <w:szCs w:val="24"/>
+        </w:rPr>
+        <w:t xml:space="preserve">The messy textured top takes thin hair's biggest weakness — lack of structure — and turns it into the entire point of the style. Texturise the top with a sea salt spray or matte clay, tousle it with your fingers, and the hair looks styled rather than flat. The low fade keeps the bottom half tight so the rougher top looks intentional, not neglected. For men who want an effortless finish without the precision of a side part or quiff, this is the lowest-effort option that still looks put together.</w:t>
       </w:r>
     </w:p>
     <w:p>
@@ -4814,14 +4363,6 @@
       <w:r>
         <w:rPr>
           <w:rFonts w:ascii="Georgia" w:cs="Georgia" w:eastAsia="Georgia" w:hAnsi="Georgia"/>
-          <w:sz w:val="24"/>
-          <w:szCs w:val="24"/>
-        </w:rPr>
-        <w:t xml:space="preserve"/>
-      </w:r>
-      <w:r>
-        <w:rPr>
-          <w:rFonts w:ascii="Georgia" w:cs="Georgia" w:eastAsia="Georgia" w:hAnsi="Georgia"/>
           <w:b/>
           <w:bCs/>
           <w:sz w:val="24"/>
@@ -4845,14 +4386,6 @@
       <w:r>
         <w:rPr>
           <w:rFonts w:ascii="Georgia" w:cs="Georgia" w:eastAsia="Georgia" w:hAnsi="Georgia"/>
-          <w:sz w:val="24"/>
-          <w:szCs w:val="24"/>
-        </w:rPr>
-        <w:t xml:space="preserve"/>
-      </w:r>
-      <w:r>
-        <w:rPr>
-          <w:rFonts w:ascii="Georgia" w:cs="Georgia" w:eastAsia="Georgia" w:hAnsi="Georgia"/>
           <w:b/>
           <w:bCs/>
           <w:sz w:val="24"/>
@@ -4876,14 +4409,6 @@
       <w:r>
         <w:rPr>
           <w:rFonts w:ascii="Georgia" w:cs="Georgia" w:eastAsia="Georgia" w:hAnsi="Georgia"/>
-          <w:sz w:val="24"/>
-          <w:szCs w:val="24"/>
-        </w:rPr>
-        <w:t xml:space="preserve"/>
-      </w:r>
-      <w:r>
-        <w:rPr>
-          <w:rFonts w:ascii="Georgia" w:cs="Georgia" w:eastAsia="Georgia" w:hAnsi="Georgia"/>
           <w:b/>
           <w:bCs/>
           <w:sz w:val="24"/>
@@ -4925,14 +4450,6 @@
       <w:r>
         <w:rPr>
           <w:rFonts w:ascii="Georgia" w:cs="Georgia" w:eastAsia="Georgia" w:hAnsi="Georgia"/>
-          <w:sz w:val="24"/>
-          <w:szCs w:val="24"/>
-        </w:rPr>
-        <w:t xml:space="preserve"/>
-      </w:r>
-      <w:r>
-        <w:rPr>
-          <w:rFonts w:ascii="Georgia" w:cs="Georgia" w:eastAsia="Georgia" w:hAnsi="Georgia"/>
           <w:b/>
           <w:bCs/>
           <w:sz w:val="24"/>
@@ -4971,14 +4488,6 @@
       <w:pPr>
         <w:spacing w:after="120" w:line="276"/>
       </w:pPr>
-      <w:r>
-        <w:rPr>
-          <w:rFonts w:ascii="Georgia" w:cs="Georgia" w:eastAsia="Georgia" w:hAnsi="Georgia"/>
-          <w:sz w:val="24"/>
-          <w:szCs w:val="24"/>
-        </w:rPr>
-        <w:t xml:space="preserve"/>
-      </w:r>
       <w:r>
         <w:rPr>
           <w:rFonts w:ascii="Georgia" w:cs="Georgia" w:eastAsia="Georgia" w:hAnsi="Georgia"/>
@@ -5043,14 +4552,6 @@
       <w:r>
         <w:rPr>
           <w:rFonts w:ascii="Georgia" w:cs="Georgia" w:eastAsia="Georgia" w:hAnsi="Georgia"/>
-          <w:sz w:val="24"/>
-          <w:szCs w:val="24"/>
-        </w:rPr>
-        <w:t xml:space="preserve"/>
-      </w:r>
-      <w:r>
-        <w:rPr>
-          <w:rFonts w:ascii="Georgia" w:cs="Georgia" w:eastAsia="Georgia" w:hAnsi="Georgia"/>
           <w:b/>
           <w:bCs/>
           <w:sz w:val="24"/>
@@ -5074,14 +4575,6 @@
       <w:r>
         <w:rPr>
           <w:rFonts w:ascii="Georgia" w:cs="Georgia" w:eastAsia="Georgia" w:hAnsi="Georgia"/>
-          <w:sz w:val="24"/>
-          <w:szCs w:val="24"/>
-        </w:rPr>
-        <w:t xml:space="preserve"/>
-      </w:r>
-      <w:r>
-        <w:rPr>
-          <w:rFonts w:ascii="Georgia" w:cs="Georgia" w:eastAsia="Georgia" w:hAnsi="Georgia"/>
           <w:b/>
           <w:bCs/>
           <w:sz w:val="24"/>
@@ -5105,28 +4598,20 @@
       <w:r>
         <w:rPr>
           <w:rFonts w:ascii="Georgia" w:cs="Georgia" w:eastAsia="Georgia" w:hAnsi="Georgia"/>
-          <w:sz w:val="24"/>
-          <w:szCs w:val="24"/>
-        </w:rPr>
-        <w:t xml:space="preserve"/>
-      </w:r>
-      <w:r>
-        <w:rPr>
-          <w:rFonts w:ascii="Georgia" w:cs="Georgia" w:eastAsia="Georgia" w:hAnsi="Georgia"/>
-          <w:b/>
-          <w:bCs/>
-          <w:sz w:val="24"/>
-          <w:szCs w:val="24"/>
-        </w:rPr>
-        <w:t xml:space="preserve">Use texture powder as a finishing tool.</w:t>
-      </w:r>
-      <w:r>
-        <w:rPr>
-          <w:rFonts w:ascii="Georgia" w:cs="Georgia" w:eastAsia="Georgia" w:hAnsi="Georgia"/>
-          <w:sz w:val="24"/>
-          <w:szCs w:val="24"/>
-        </w:rPr>
-        <w:t xml:space="preserve"> Texture powder absorbs oil, adds grip, and creates instant volume at the roots without any weight. Sprinkle a small amount at the crown and the front, then work it in with your fingertips. For men with </w:t>
+          <w:b/>
+          <w:bCs/>
+          <w:sz w:val="24"/>
+          <w:szCs w:val="24"/>
+        </w:rPr>
+        <w:t xml:space="preserve">Finish with texture powder at the roots.</w:t>
+      </w:r>
+      <w:r>
+        <w:rPr>
+          <w:rFonts w:ascii="Georgia" w:cs="Georgia" w:eastAsia="Georgia" w:hAnsi="Georgia"/>
+          <w:sz w:val="24"/>
+          <w:szCs w:val="24"/>
+        </w:rPr>
+        <w:t xml:space="preserve"> Sprinkle a small amount at the crown and the front, then work it in with your fingertips. For men with </w:t>
       </w:r>
       <w:r>
         <w:rPr>
@@ -5144,38 +4629,30 @@
           <w:sz w:val="24"/>
           <w:szCs w:val="24"/>
         </w:rPr>
-        <w:t xml:space="preserve">, texture powder is the closest thing to a cheat code — it makes fine strands behave like medium-density hair for six to eight hours.</w:t>
-      </w:r>
-    </w:p>
-    <w:p>
-      <w:pPr>
-        <w:spacing w:after="120" w:line="276"/>
-      </w:pPr>
-      <w:r>
-        <w:rPr>
-          <w:rFonts w:ascii="Georgia" w:cs="Georgia" w:eastAsia="Georgia" w:hAnsi="Georgia"/>
-          <w:sz w:val="24"/>
-          <w:szCs w:val="24"/>
-        </w:rPr>
-        <w:t xml:space="preserve"/>
-      </w:r>
-      <w:r>
-        <w:rPr>
-          <w:rFonts w:ascii="Georgia" w:cs="Georgia" w:eastAsia="Georgia" w:hAnsi="Georgia"/>
-          <w:b/>
-          <w:bCs/>
-          <w:sz w:val="24"/>
-          <w:szCs w:val="24"/>
-        </w:rPr>
-        <w:t xml:space="preserve">Never skip the pre-style.</w:t>
-      </w:r>
-      <w:r>
-        <w:rPr>
-          <w:rFonts w:ascii="Georgia" w:cs="Georgia" w:eastAsia="Georgia" w:hAnsi="Georgia"/>
-          <w:sz w:val="24"/>
-          <w:szCs w:val="24"/>
-        </w:rPr>
-        <w:t xml:space="preserve"> Volumising mousse or a lightweight thickening spray applied to damp hair before blow-drying gives thin strands a scaffolding to hold shape. Without a pre-style, even the best clay slides off straight hair by midday.</w:t>
+        <w:t xml:space="preserve">, texture powder is the single best finishing product — it adds grip and lift without any weight, and fine strands hold shape for six to eight hours.</w:t>
+      </w:r>
+    </w:p>
+    <w:p>
+      <w:pPr>
+        <w:spacing w:after="120" w:line="276"/>
+      </w:pPr>
+      <w:r>
+        <w:rPr>
+          <w:rFonts w:ascii="Georgia" w:cs="Georgia" w:eastAsia="Georgia" w:hAnsi="Georgia"/>
+          <w:b/>
+          <w:bCs/>
+          <w:sz w:val="24"/>
+          <w:szCs w:val="24"/>
+        </w:rPr>
+        <w:t xml:space="preserve">Build a base before you style.</w:t>
+      </w:r>
+      <w:r>
+        <w:rPr>
+          <w:rFonts w:ascii="Georgia" w:cs="Georgia" w:eastAsia="Georgia" w:hAnsi="Georgia"/>
+          <w:sz w:val="24"/>
+          <w:szCs w:val="24"/>
+        </w:rPr>
+        <w:t xml:space="preserve"> Apply a volumising mousse or lightweight thickening spray to damp hair before blow-drying. This gives thin strands a scaffolding that holds the shape your blow-dryer creates. Skip this step and even the best finishing product slides off straight hair by midday.</w:t>
       </w:r>
     </w:p>
     <w:p>
@@ -5223,14 +4700,6 @@
       <w:r>
         <w:rPr>
           <w:rFonts w:ascii="Georgia" w:cs="Georgia" w:eastAsia="Georgia" w:hAnsi="Georgia"/>
-          <w:sz w:val="24"/>
-          <w:szCs w:val="24"/>
-        </w:rPr>
-        <w:t xml:space="preserve"/>
-      </w:r>
-      <w:r>
-        <w:rPr>
-          <w:rFonts w:ascii="Georgia" w:cs="Georgia" w:eastAsia="Georgia" w:hAnsi="Georgia"/>
           <w:b/>
           <w:bCs/>
           <w:sz w:val="24"/>
@@ -5254,14 +4723,6 @@
       <w:r>
         <w:rPr>
           <w:rFonts w:ascii="Georgia" w:cs="Georgia" w:eastAsia="Georgia" w:hAnsi="Georgia"/>
-          <w:sz w:val="24"/>
-          <w:szCs w:val="24"/>
-        </w:rPr>
-        <w:t xml:space="preserve"/>
-      </w:r>
-      <w:r>
-        <w:rPr>
-          <w:rFonts w:ascii="Georgia" w:cs="Georgia" w:eastAsia="Georgia" w:hAnsi="Georgia"/>
           <w:b/>
           <w:bCs/>
           <w:sz w:val="24"/>
@@ -5285,14 +4746,6 @@
       <w:r>
         <w:rPr>
           <w:rFonts w:ascii="Georgia" w:cs="Georgia" w:eastAsia="Georgia" w:hAnsi="Georgia"/>
-          <w:sz w:val="24"/>
-          <w:szCs w:val="24"/>
-        </w:rPr>
-        <w:t xml:space="preserve"/>
-      </w:r>
-      <w:r>
-        <w:rPr>
-          <w:rFonts w:ascii="Georgia" w:cs="Georgia" w:eastAsia="Georgia" w:hAnsi="Georgia"/>
           <w:b/>
           <w:bCs/>
           <w:sz w:val="24"/>
@@ -5316,14 +4769,6 @@
       <w:r>
         <w:rPr>
           <w:rFonts w:ascii="Georgia" w:cs="Georgia" w:eastAsia="Georgia" w:hAnsi="Georgia"/>
-          <w:sz w:val="24"/>
-          <w:szCs w:val="24"/>
-        </w:rPr>
-        <w:t xml:space="preserve"/>
-      </w:r>
-      <w:r>
-        <w:rPr>
-          <w:rFonts w:ascii="Georgia" w:cs="Georgia" w:eastAsia="Georgia" w:hAnsi="Georgia"/>
           <w:b/>
           <w:bCs/>
           <w:sz w:val="24"/>
@@ -5344,14 +4789,6 @@
       <w:pPr>
         <w:spacing w:after="120" w:line="276"/>
       </w:pPr>
-      <w:r>
-        <w:rPr>
-          <w:rFonts w:ascii="Georgia" w:cs="Georgia" w:eastAsia="Georgia" w:hAnsi="Georgia"/>
-          <w:sz w:val="24"/>
-          <w:szCs w:val="24"/>
-        </w:rPr>
-        <w:t xml:space="preserve"/>
-      </w:r>
       <w:r>
         <w:rPr>
           <w:rFonts w:ascii="Georgia" w:cs="Georgia" w:eastAsia="Georgia" w:hAnsi="Georgia"/>
@@ -5429,14 +4866,6 @@
       <w:r>
         <w:rPr>
           <w:rFonts w:ascii="Georgia" w:cs="Georgia" w:eastAsia="Georgia" w:hAnsi="Georgia"/>
-          <w:sz w:val="24"/>
-          <w:szCs w:val="24"/>
-        </w:rPr>
-        <w:t xml:space="preserve"/>
-      </w:r>
-      <w:r>
-        <w:rPr>
-          <w:rFonts w:ascii="Georgia" w:cs="Georgia" w:eastAsia="Georgia" w:hAnsi="Georgia"/>
           <w:b/>
           <w:bCs/>
           <w:sz w:val="24"/>
@@ -5460,14 +4889,6 @@
       <w:r>
         <w:rPr>
           <w:rFonts w:ascii="Georgia" w:cs="Georgia" w:eastAsia="Georgia" w:hAnsi="Georgia"/>
-          <w:sz w:val="24"/>
-          <w:szCs w:val="24"/>
-        </w:rPr>
-        <w:t xml:space="preserve"/>
-      </w:r>
-      <w:r>
-        <w:rPr>
-          <w:rFonts w:ascii="Georgia" w:cs="Georgia" w:eastAsia="Georgia" w:hAnsi="Georgia"/>
           <w:b/>
           <w:bCs/>
           <w:sz w:val="24"/>
@@ -5491,14 +4912,6 @@
       <w:r>
         <w:rPr>
           <w:rFonts w:ascii="Georgia" w:cs="Georgia" w:eastAsia="Georgia" w:hAnsi="Georgia"/>
-          <w:sz w:val="24"/>
-          <w:szCs w:val="24"/>
-        </w:rPr>
-        <w:t xml:space="preserve"/>
-      </w:r>
-      <w:r>
-        <w:rPr>
-          <w:rFonts w:ascii="Georgia" w:cs="Georgia" w:eastAsia="Georgia" w:hAnsi="Georgia"/>
           <w:b/>
           <w:bCs/>
           <w:sz w:val="24"/>
@@ -5519,14 +4932,6 @@
       <w:pPr>
         <w:spacing w:after="120" w:line="276"/>
       </w:pPr>
-      <w:r>
-        <w:rPr>
-          <w:rFonts w:ascii="Georgia" w:cs="Georgia" w:eastAsia="Georgia" w:hAnsi="Georgia"/>
-          <w:sz w:val="24"/>
-          <w:szCs w:val="24"/>
-        </w:rPr>
-        <w:t xml:space="preserve"/>
-      </w:r>
       <w:r>
         <w:rPr>
           <w:rFonts w:ascii="Georgia" w:cs="Georgia" w:eastAsia="Georgia" w:hAnsi="Georgia"/>
@@ -5711,20 +5116,20 @@
           <w:sz w:val="26"/>
           <w:szCs w:val="26"/>
         </w:rPr>
-        <w:t xml:space="preserve">Does thin hair look better short or long on men?</w:t>
-      </w:r>
-    </w:p>
-    <w:p>
-      <w:pPr>
-        <w:spacing w:after="120" w:line="276"/>
-      </w:pPr>
-      <w:r>
-        <w:rPr>
-          <w:rFonts w:ascii="Georgia" w:cs="Georgia" w:eastAsia="Georgia" w:hAnsi="Georgia"/>
-          <w:sz w:val="24"/>
-          <w:szCs w:val="24"/>
-        </w:rPr>
-        <w:t xml:space="preserve">Short. Thin straight hair gains volume and structure from shorter cuts that keep strands upright. Anything past three inches on top relies on density that fine hair doesn't have, and gravity pulls it flat against the scalp.</w:t>
+        <w:t xml:space="preserve">Can thin straight hair be made to look thicker permanently without surgery?</w:t>
+      </w:r>
+    </w:p>
+    <w:p>
+      <w:pPr>
+        <w:spacing w:after="120" w:line="276"/>
+      </w:pPr>
+      <w:r>
+        <w:rPr>
+          <w:rFonts w:ascii="Georgia" w:cs="Georgia" w:eastAsia="Georgia" w:hAnsi="Georgia"/>
+          <w:sz w:val="24"/>
+          <w:szCs w:val="24"/>
+        </w:rPr>
+        <w:t xml:space="preserve">Scalp micro-pigmentation (SMP) tattoos tiny dots between existing follicles, creating the appearance of density at the root level. It doesn't add real hair, but on thin straight strands the illusion of a fuller scalp is convincing enough that even close-range viewing holds up. Results last three to five years before a touch-up is needed.</w:t>
       </w:r>
     </w:p>
     <w:p>
@@ -5741,20 +5146,20 @@
           <w:sz w:val="26"/>
           <w:szCs w:val="26"/>
         </w:rPr>
-        <w:t xml:space="preserve">Can men with thin straight hair pull off a fade?</w:t>
-      </w:r>
-    </w:p>
-    <w:p>
-      <w:pPr>
-        <w:spacing w:after="120" w:line="276"/>
-      </w:pPr>
-      <w:r>
-        <w:rPr>
-          <w:rFonts w:ascii="Georgia" w:cs="Georgia" w:eastAsia="Georgia" w:hAnsi="Georgia"/>
-          <w:sz w:val="24"/>
-          <w:szCs w:val="24"/>
-        </w:rPr>
-        <w:t xml:space="preserve">A fade is one of the best choices — it removes bulk from the sides where thin hair shows the least contrast, and the gradual blend prevents hard lines that expose density differences. Low and mid fades work best; skin fades suit men comfortable with fortnightly maintenance.</w:t>
+        <w:t xml:space="preserve">Does hair colour affect how thin straight hair looks?</w:t>
+      </w:r>
+    </w:p>
+    <w:p>
+      <w:pPr>
+        <w:spacing w:after="120" w:line="276"/>
+      </w:pPr>
+      <w:r>
+        <w:rPr>
+          <w:rFonts w:ascii="Georgia" w:cs="Georgia" w:eastAsia="Georgia" w:hAnsi="Georgia"/>
+          <w:sz w:val="24"/>
+          <w:szCs w:val="24"/>
+        </w:rPr>
+        <w:t xml:space="preserve">Yes — a colour that closely matches your scalp tone reduces the contrast between hair and skin, so thin patches become less visible. Dark hair on a light scalp highlights every gap. If you're not open to colouring, ask your barber about a root-thickening fibre spray in your natural shade for the same effect day-to-day.</w:t>
       </w:r>
     </w:p>
     <w:p>
@@ -5771,20 +5176,20 @@
           <w:sz w:val="26"/>
           <w:szCs w:val="26"/>
         </w:rPr>
-        <w:t xml:space="preserve">How often should men with thin straight hair get a haircut?</w:t>
-      </w:r>
-    </w:p>
-    <w:p>
-      <w:pPr>
-        <w:spacing w:after="120" w:line="276"/>
-      </w:pPr>
-      <w:r>
-        <w:rPr>
-          <w:rFonts w:ascii="Georgia" w:cs="Georgia" w:eastAsia="Georgia" w:hAnsi="Georgia"/>
-          <w:sz w:val="24"/>
-          <w:szCs w:val="24"/>
-        </w:rPr>
-        <w:t xml:space="preserve">Every two to four weeks depending on the style. Buzz cuts and fades grow out visibly within two weeks. Textured crops and crew cuts hold shape for three to four weeks. Classic tapers last four to five weeks before they look overgrown.</w:t>
+        <w:t xml:space="preserve">Should men with thin straight hair wash their hair every day?</w:t>
+      </w:r>
+    </w:p>
+    <w:p>
+      <w:pPr>
+        <w:spacing w:after="120" w:line="276"/>
+      </w:pPr>
+      <w:r>
+        <w:rPr>
+          <w:rFonts w:ascii="Georgia" w:cs="Georgia" w:eastAsia="Georgia" w:hAnsi="Georgia"/>
+          <w:sz w:val="24"/>
+          <w:szCs w:val="24"/>
+        </w:rPr>
+        <w:t xml:space="preserve">Daily washing strips the natural oils that give thin strands grip and body. Washing every two to three days keeps enough oil at the roots for texture without the hair looking greasy. On non-wash days, dry shampoo at the roots absorbs excess oil and adds volume — it's the better daily habit for fine hair.</w:t>
       </w:r>
     </w:p>
     <w:p>
@@ -5801,20 +5206,20 @@
           <w:sz w:val="26"/>
           <w:szCs w:val="26"/>
         </w:rPr>
-        <w:t xml:space="preserve">Is a buzz cut the only option for severely thinning straight hair?</w:t>
-      </w:r>
-    </w:p>
-    <w:p>
-      <w:pPr>
-        <w:spacing w:after="120" w:line="276"/>
-      </w:pPr>
-      <w:r>
-        <w:rPr>
-          <w:rFonts w:ascii="Georgia" w:cs="Georgia" w:eastAsia="Georgia" w:hAnsi="Georgia"/>
-          <w:sz w:val="24"/>
-          <w:szCs w:val="24"/>
-        </w:rPr>
-        <w:t xml:space="preserve">No. A French crop, Caesar cut, or textured crop all work on significantly thinning hair by redirecting coverage to the thinnest areas. The buzz cut is the lowest-effort option, but not the only one. If your scalp is visible through the top hair when it's dry and styled, a buzz cut becomes the cleanest choice.</w:t>
+        <w:t xml:space="preserve">Does diet or nutrition actually affect hair thickness?</w:t>
+      </w:r>
+    </w:p>
+    <w:p>
+      <w:pPr>
+        <w:spacing w:after="120" w:line="276"/>
+      </w:pPr>
+      <w:r>
+        <w:rPr>
+          <w:rFonts w:ascii="Georgia" w:cs="Georgia" w:eastAsia="Georgia" w:hAnsi="Georgia"/>
+          <w:sz w:val="24"/>
+          <w:szCs w:val="24"/>
+        </w:rPr>
+        <w:t xml:space="preserve">Iron, zinc, biotin, and protein intake directly influence hair diameter and growth rate. A deficiency in any of these can make already-thin hair shed faster and grow back finer. A blood test through your GP identifies specific gaps — generic hair supplements won't help if the deficiency isn't there.</w:t>
       </w:r>
     </w:p>
     <w:p>
@@ -5831,38 +5236,38 @@
           <w:sz w:val="26"/>
           <w:szCs w:val="26"/>
         </w:rPr>
-        <w:t xml:space="preserve">What is the best haircut for men over 50 with thin straight hair?</w:t>
-      </w:r>
-    </w:p>
-    <w:p>
-      <w:pPr>
-        <w:spacing w:after="120" w:line="276"/>
-      </w:pPr>
-      <w:r>
-        <w:rPr>
-          <w:rFonts w:ascii="Georgia" w:cs="Georgia" w:eastAsia="Georgia" w:hAnsi="Georgia"/>
-          <w:sz w:val="24"/>
-          <w:szCs w:val="24"/>
-        </w:rPr>
-        <w:t xml:space="preserve">The classic taper, crew cut, and short back and sides are the three most consistently effective cuts for older men with thinning straight hair. They require minimal styling, grow out cleanly, and suit professional settings without looking like they're trying to recapture a younger style. </w:t>
-      </w:r>
-      <w:r>
-        <w:rPr>
-          <w:rFonts w:ascii="Georgia" w:cs="Georgia" w:eastAsia="Georgia" w:hAnsi="Georgia"/>
-          <w:b/>
-          <w:bCs/>
-          <w:sz w:val="24"/>
-          <w:szCs w:val="24"/>
-        </w:rPr>
-        <w:t xml:space="preserve">Low-maintenance haircuts for older guys with thinning hair</w:t>
-      </w:r>
-      <w:r>
-        <w:rPr>
-          <w:rFonts w:ascii="Georgia" w:cs="Georgia" w:eastAsia="Georgia" w:hAnsi="Georgia"/>
-          <w:sz w:val="24"/>
-          <w:szCs w:val="24"/>
-        </w:rPr>
-        <w:t xml:space="preserve"> should prioritise clean lines and easy upkeep over trendy finishes.</w:t>
+        <w:t xml:space="preserve">Is it worth getting a hair system or topper for thin straight hair?</w:t>
+      </w:r>
+    </w:p>
+    <w:p>
+      <w:pPr>
+        <w:spacing w:after="120" w:line="276"/>
+      </w:pPr>
+      <w:r>
+        <w:rPr>
+          <w:rFonts w:ascii="Georgia" w:cs="Georgia" w:eastAsia="Georgia" w:hAnsi="Georgia"/>
+          <w:sz w:val="24"/>
+          <w:szCs w:val="24"/>
+        </w:rPr>
+        <w:t xml:space="preserve">Modern hair systems bond to the scalp with medical-grade adhesive and last four to six weeks per application. For men whose thinning has passed the point where a haircut alone provides coverage, a well-matched system on thin straight hair is nearly undetectable — </w:t>
+      </w:r>
+      <w:r>
+        <w:rPr>
+          <w:rFonts w:ascii="Georgia" w:cs="Georgia" w:eastAsia="Georgia" w:hAnsi="Georgia"/>
+          <w:b/>
+          <w:bCs/>
+          <w:sz w:val="24"/>
+          <w:szCs w:val="24"/>
+        </w:rPr>
+        <w:t xml:space="preserve">low-maintenance haircuts for older guys with thinning hair</w:t>
+      </w:r>
+      <w:r>
+        <w:rPr>
+          <w:rFonts w:ascii="Georgia" w:cs="Georgia" w:eastAsia="Georgia" w:hAnsi="Georgia"/>
+          <w:sz w:val="24"/>
+          <w:szCs w:val="24"/>
+        </w:rPr>
+        <w:t xml:space="preserve"> become much easier when the base density is supplemented. The trade-off is cost: expect to spend on monthly maintenance and replacement units every few months.</w:t>
       </w:r>
     </w:p>
     <w:p>
@@ -5879,20 +5284,20 @@
           <w:sz w:val="26"/>
           <w:szCs w:val="26"/>
         </w:rPr>
-        <w:t xml:space="preserve">Does blow-drying damage thin hair?</w:t>
-      </w:r>
-    </w:p>
-    <w:p>
-      <w:pPr>
-        <w:spacing w:after="120" w:line="276"/>
-      </w:pPr>
-      <w:r>
-        <w:rPr>
-          <w:rFonts w:ascii="Georgia" w:cs="Georgia" w:eastAsia="Georgia" w:hAnsi="Georgia"/>
-          <w:sz w:val="24"/>
-          <w:szCs w:val="24"/>
-        </w:rPr>
-        <w:t xml:space="preserve">When done correctly — medium heat, constant movement, never concentrating on one spot — blow-drying does not damage thin hair. The heat straightens the cuticle and locks volume into the roots. The damage comes from high heat held in place, which thin strands tolerate even less than thick hair. Use a heat protectant spray if you blow-dry daily.</w:t>
+        <w:t xml:space="preserve">Can scalp massages or derma-rolling help thin hair grow thicker?</w:t>
+      </w:r>
+    </w:p>
+    <w:p>
+      <w:pPr>
+        <w:spacing w:after="120" w:line="276"/>
+      </w:pPr>
+      <w:r>
+        <w:rPr>
+          <w:rFonts w:ascii="Georgia" w:cs="Georgia" w:eastAsia="Georgia" w:hAnsi="Georgia"/>
+          <w:sz w:val="24"/>
+          <w:szCs w:val="24"/>
+        </w:rPr>
+        <w:t xml:space="preserve">Derma-rolling (microneedling) at 0.5mm to 1.5mm depth has clinical evidence supporting increased hair density when combined with minoxidil. Scalp massage alone improves blood flow but has limited evidence for thickness gains. Neither replaces a proper haircut — they're supplementary steps that may improve the raw material your barber works with over six to twelve months of consistent use.</w:t>
       </w:r>
     </w:p>
     <w:p>
@@ -5918,6 +5323,14 @@
         </w:rPr>
         <w:t xml:space="preserve">Written by Amir Khan — professional hairstylist with over 8 years of experience cutting and styling men's hair across all textures and densities.</w:t>
       </w:r>
+    </w:p>
+    <w:p>
+      <w:pPr>
+        <w:pBdr>
+          <w:bottom w:val="single" w:color="cccccc" w:sz="6"/>
+        </w:pBdr>
+        <w:spacing w:after="200" w:before="200"/>
+      </w:pPr>
     </w:p>
     <w:sectPr>
       <w:pgSz w:w="12240" w:h="15840" w:orient="portrait"/>

</xml_diff>

<commit_message>
V3: Fix factual errors, add treatment section, verify all claims
- Fixed George Clooney claim (ER/1990s context, not thinning years)
- Fixed SMP duration: 4-6 years (was incorrectly 3-5)
- Fixed nutrition FAQ: biotin lacks evidence in non-deficient people
  (cited 2024 JCAD systematic review)
- Fixed derma-rolling timeline: 2-3 months initial, 6 months peak
  (cited Dhurat 2013 RCT with 4x hair count improvement)
- Added missing H2: haircuts vs hair loss treatment (minoxidil/finasteride)
  - all top competitors cover this; our V2 missed it entirely
- Placed missing seed keywords: "haircuts for guys with thin straight hair",
  "mens short haircuts for thin hair"
- Tightened Products section to reduce overlap with Styling tips

Co-Authored-By: Claude Opus 4.6 <noreply@anthropic.com>
Claude-Session: https://claude.ai/code/session_013k2EdyZEATdeqZhaNxEy9F
</commit_message>
<xml_diff>
--- a/Thin-Straight-Hair-Haircuts-for-Men.docx
+++ b/Thin-Straight-Hair-Haircuts-for-Men.docx
@@ -67,7 +67,25 @@
           <w:sz w:val="24"/>
           <w:szCs w:val="24"/>
         </w:rPr>
-        <w:t xml:space="preserve">This is the opposite approach. Every cut below was chosen because it works with — not against — fine, straight strands. I've spent eight years behind the chair cutting thin hair on men who thought nothing would work, and the pattern is always the same: the right cut does eighty percent of the job before any product touches the hair. Get the structure wrong, and no amount of matte clay saves it.</w:t>
+        <w:t xml:space="preserve">This is the opposite approach. These are </w:t>
+      </w:r>
+      <w:r>
+        <w:rPr>
+          <w:rFonts w:ascii="Georgia" w:cs="Georgia" w:eastAsia="Georgia" w:hAnsi="Georgia"/>
+          <w:b/>
+          <w:bCs/>
+          <w:sz w:val="24"/>
+          <w:szCs w:val="24"/>
+        </w:rPr>
+        <w:t xml:space="preserve">haircuts for guys with thin straight hair</w:t>
+      </w:r>
+      <w:r>
+        <w:rPr>
+          <w:rFonts w:ascii="Georgia" w:cs="Georgia" w:eastAsia="Georgia" w:hAnsi="Georgia"/>
+          <w:sz w:val="24"/>
+          <w:szCs w:val="24"/>
+        </w:rPr>
+        <w:t xml:space="preserve"> that actually work with — not against — fine strands. I've spent eight years behind the chair cutting thin hair on men who thought nothing would work, and the pattern is always the same: the right cut does eighty percent of the job before any product touches the hair. Get the structure wrong, and no amount of matte clay saves it.</w:t>
       </w:r>
     </w:p>
     <w:p>
@@ -645,7 +663,25 @@
           <w:sz w:val="24"/>
           <w:szCs w:val="24"/>
         </w:rPr>
-        <w:t xml:space="preserve">The buzz cut removes any contrast between thick and thin patches. When everything sits at a uniform half-inch or less, density gaps vanish and the focus moves to your jawline, cheekbones, and head shape. For men whose thinning has gone past what textured cuts can handle, a </w:t>
+        <w:t xml:space="preserve">Among </w:t>
+      </w:r>
+      <w:r>
+        <w:rPr>
+          <w:rFonts w:ascii="Georgia" w:cs="Georgia" w:eastAsia="Georgia" w:hAnsi="Georgia"/>
+          <w:b/>
+          <w:bCs/>
+          <w:sz w:val="24"/>
+          <w:szCs w:val="24"/>
+        </w:rPr>
+        <w:t xml:space="preserve">mens short haircuts for thin hair</w:t>
+      </w:r>
+      <w:r>
+        <w:rPr>
+          <w:rFonts w:ascii="Georgia" w:cs="Georgia" w:eastAsia="Georgia" w:hAnsi="Georgia"/>
+          <w:sz w:val="24"/>
+          <w:szCs w:val="24"/>
+        </w:rPr>
+        <w:t xml:space="preserve">, the buzz cut is the most decisive — it removes any contrast between thick and thin patches. When everything sits at a uniform half-inch or less, density gaps vanish and the focus moves to your jawline, cheekbones, and head shape. For men whose thinning has gone past what textured cuts can handle, a </w:t>
       </w:r>
       <w:r>
         <w:rPr>
@@ -995,7 +1031,7 @@
           <w:sz w:val="24"/>
           <w:szCs w:val="24"/>
         </w:rPr>
-        <w:t xml:space="preserve">The Caesar directs hair forward across the hairline — the exact area where thin straight hair exposes gaps first. That short horizontal fringe creates a defined front edge that masks recession without looking like a cover-up. George Clooney wore a Caesar through his early thinning years, and it worked precisely because the cut never tries to hide anything — it just redirects. For men with a </w:t>
+        <w:t xml:space="preserve">The Caesar directs hair forward across the hairline — the exact area where thin straight hair exposes gaps first. That short horizontal fringe creates a defined front edge that masks recession without looking like a cover-up. George Clooney made the Caesar mainstream during his ER years in the mid-1990s, and the style originally dates back to Julius Caesar himself, who reportedly wore his hair brushed forward to cover a thinning hairline. For men with a </w:t>
       </w:r>
       <w:r>
         <w:rPr>
@@ -4713,7 +4749,7 @@
           <w:sz w:val="24"/>
           <w:szCs w:val="24"/>
         </w:rPr>
-        <w:t xml:space="preserve"> Provides hold and texture without weight or shine. The matte finish absorbs light rather than reflecting it, which prevents thin hair from looking greasy or see-through. Best for textured crops, quiffs, and brush-up styles.</w:t>
+        <w:t xml:space="preserve"> Medium hold, zero shine. The matte finish stops thin hair from looking greasy or see-through under direct light. Use a pea-sized amount — any more and it weighs fine strands down. Best for textured crops, quiffs, and brush-up styles.</w:t>
       </w:r>
     </w:p>
     <w:p>
@@ -4736,7 +4772,7 @@
           <w:sz w:val="24"/>
           <w:szCs w:val="24"/>
         </w:rPr>
-        <w:t xml:space="preserve"> Zero-weight volume and grip. Absorbs oil at the root and creates separation between strands. Best as a finishing product over blow-dried hair.</w:t>
+        <w:t xml:space="preserve"> The lightest-weight option on this list. Sprinkle it at the roots, rub it in, and it absorbs oil while adding grip that lasts six to eight hours. Best as a final step over blow-dried hair, not as a standalone product.</w:t>
       </w:r>
     </w:p>
     <w:p>
@@ -5099,6 +5135,70 @@
           <w:sz w:val="30"/>
           <w:szCs w:val="30"/>
         </w:rPr>
+        <w:t xml:space="preserve">A Haircut Won't Stop Hair Loss — When to Consider Treatment</w:t>
+      </w:r>
+    </w:p>
+    <w:p>
+      <w:pPr>
+        <w:spacing w:after="120" w:line="276"/>
+      </w:pPr>
+      <w:r>
+        <w:rPr>
+          <w:rFonts w:ascii="Georgia" w:cs="Georgia" w:eastAsia="Georgia" w:hAnsi="Georgia"/>
+          <w:sz w:val="24"/>
+          <w:szCs w:val="24"/>
+        </w:rPr>
+        <w:t xml:space="preserve">The right haircut manages how thin hair looks, but it does not slow the thinning itself. If your hair density has visibly decreased over the past year, a cut buys you time and confidence — it doesn't address the underlying cause.</w:t>
+      </w:r>
+    </w:p>
+    <w:p>
+      <w:pPr>
+        <w:spacing w:after="120" w:line="276"/>
+      </w:pPr>
+      <w:r>
+        <w:rPr>
+          <w:rFonts w:ascii="Georgia" w:cs="Georgia" w:eastAsia="Georgia" w:hAnsi="Georgia"/>
+          <w:sz w:val="24"/>
+          <w:szCs w:val="24"/>
+        </w:rPr>
+        <w:t xml:space="preserve">The only FDA-approved treatments for male pattern hair loss are minoxidil (topical, available over the counter) and finasteride (oral, prescription only). Minoxidil widens blood vessels in the scalp to stimulate follicle activity; finasteride blocks the hormone DHT that shrinks follicles at the temples and crown. Both work best when started early — waiting until the scalp is fully visible makes recovery harder.</w:t>
+      </w:r>
+    </w:p>
+    <w:p>
+      <w:pPr>
+        <w:spacing w:after="120" w:line="276"/>
+      </w:pPr>
+      <w:r>
+        <w:rPr>
+          <w:rFonts w:ascii="Georgia" w:cs="Georgia" w:eastAsia="Georgia" w:hAnsi="Georgia"/>
+          <w:sz w:val="24"/>
+          <w:szCs w:val="24"/>
+        </w:rPr>
+        <w:t xml:space="preserve">This isn't a section about choosing treatments — that's a conversation between you and a dermatologist. But every barber who's been behind the chair long enough will tell you the same thing: the men who keep the most hair are the ones who paired a good haircut with early medical advice rather than relying on styling alone.</w:t>
+      </w:r>
+    </w:p>
+    <w:p>
+      <w:pPr>
+        <w:pBdr>
+          <w:bottom w:val="single" w:color="cccccc" w:sz="6"/>
+        </w:pBdr>
+        <w:spacing w:after="200" w:before="200"/>
+      </w:pPr>
+    </w:p>
+    <w:p>
+      <w:pPr>
+        <w:pStyle w:val="Heading2"/>
+        <w:spacing w:after="160" w:before="360"/>
+      </w:pPr>
+      <w:r>
+        <w:rPr>
+          <w:rFonts w:ascii="Georgia" w:cs="Georgia" w:eastAsia="Georgia" w:hAnsi="Georgia"/>
+          <w:b/>
+          <w:bCs/>
+          <w:color w:val="2c2c2c"/>
+          <w:sz w:val="30"/>
+          <w:szCs w:val="30"/>
+        </w:rPr>
         <w:t xml:space="preserve">FAQ</w:t>
       </w:r>
     </w:p>
@@ -5129,7 +5229,7 @@
           <w:sz w:val="24"/>
           <w:szCs w:val="24"/>
         </w:rPr>
-        <w:t xml:space="preserve">Scalp micro-pigmentation (SMP) tattoos tiny dots between existing follicles, creating the appearance of density at the root level. It doesn't add real hair, but on thin straight strands the illusion of a fuller scalp is convincing enough that even close-range viewing holds up. Results last three to five years before a touch-up is needed.</w:t>
+        <w:t xml:space="preserve">Scalp micro-pigmentation (SMP) tattoos tiny dots between existing follicles, creating the appearance of density at the root level. It doesn't add real hair, but on thin straight strands the result is convincing enough that even close-range viewing holds up. Most SMP treatments last four to six years before requiring a touch-up, though factors like skin type and sun exposure affect how quickly the pigment fades.</w:t>
       </w:r>
     </w:p>
     <w:p>
@@ -5219,7 +5319,7 @@
           <w:sz w:val="24"/>
           <w:szCs w:val="24"/>
         </w:rPr>
-        <w:t xml:space="preserve">Iron, zinc, biotin, and protein intake directly influence hair diameter and growth rate. A deficiency in any of these can make already-thin hair shed faster and grow back finer. A blood test through your GP identifies specific gaps — generic hair supplements won't help if the deficiency isn't there.</w:t>
+        <w:t xml:space="preserve">A deficiency in iron, zinc, or biotin can make already-thin hair shed faster and grow back finer — but supplementing these nutrients only helps when a genuine deficiency exists. A 2024 JCAD systematic review found no difference between biotin and placebo groups in people with normal biotin levels. A blood test through your GP identifies whether a real gap exists before you spend on supplements that may do nothing.</w:t>
       </w:r>
     </w:p>
     <w:p>
@@ -5297,7 +5397,7 @@
           <w:sz w:val="24"/>
           <w:szCs w:val="24"/>
         </w:rPr>
-        <w:t xml:space="preserve">Derma-rolling (microneedling) at 0.5mm to 1.5mm depth has clinical evidence supporting increased hair density when combined with minoxidil. Scalp massage alone improves blood flow but has limited evidence for thickness gains. Neither replaces a proper haircut — they're supplementary steps that may improve the raw material your barber works with over six to twelve months of consistent use.</w:t>
+        <w:t xml:space="preserve">Derma-rolling (microneedling) at 0.5mm to 1.5mm depth has clinical support — a 2013 randomised controlled trial by Dhurat showed a fourfold increase in hair count when microneedling was combined with minoxidil versus minoxidil alone. Initial results typically show within two to three months, with peak improvement at around six months. Scalp massage alone improves blood flow but has limited evidence for thickness gains. Neither replaces a proper haircut — they may improve what your barber has to work with, but they won't fix a bad cut.</w:t>
       </w:r>
     </w:p>
     <w:p>

</xml_diff>

<commit_message>
Add internal links to article (Caesar, High and Tight, Undercut Fade, Oblong Faces)
Co-Authored-By: Claude Opus 4.6 <noreply@anthropic.com>
Claude-Session: https://claude.ai/code/session_013k2EdyZEATdeqZhaNxEy9F
</commit_message>
<xml_diff>
--- a/Thin-Straight-Hair-Haircuts-for-Men.docx
+++ b/Thin-Straight-Hair-Haircuts-for-Men.docx
@@ -136,7 +136,25 @@
           <w:sz w:val="24"/>
           <w:szCs w:val="24"/>
         </w:rPr>
-        <w:t xml:space="preserve">Thin straight hair lacks the natural body that wavy or curly textures provide. Every extra millimetre of length pulls hair flat against the scalp, making sparse patches more obvious. The best haircuts for men with thin straight hair remove weight at the ends through point cutting or razor texturising, keep the top between one and three inches, and graduate the sides with a taper or fade so the proportions stay balanced.</w:t>
+        <w:t xml:space="preserve">Thin straight hair lacks the natural body that wavy or curly textures provide. Every extra millimetre of length pulls hair flat against the scalp, making sparse patches more obvious. The best haircuts for men with thin straight hair remove weight at the ends through point cutting or razor texturising, keep the top between one and three inches, and graduate the sides with a taper or </w:t>
+      </w:r>
+      <w:r>
+        <w:rPr>
+          <w:rFonts w:ascii="Georgia" w:cs="Georgia" w:eastAsia="Georgia" w:hAnsi="Georgia"/>
+          <w:b/>
+          <w:bCs/>
+          <w:sz w:val="24"/>
+          <w:szCs w:val="24"/>
+        </w:rPr>
+        <w:t xml:space="preserve">fade</w:t>
+      </w:r>
+      <w:r>
+        <w:rPr>
+          <w:rFonts w:ascii="Georgia" w:cs="Georgia" w:eastAsia="Georgia" w:hAnsi="Georgia"/>
+          <w:sz w:val="24"/>
+          <w:szCs w:val="24"/>
+        </w:rPr>
+        <w:t xml:space="preserve"> so the proportions stay balanced.</w:t>
       </w:r>
     </w:p>
     <w:p>
@@ -1031,7 +1049,7 @@
           <w:sz w:val="24"/>
           <w:szCs w:val="24"/>
         </w:rPr>
-        <w:t xml:space="preserve">The Caesar directs hair forward across the hairline — the exact area where thin straight hair exposes gaps first. That short horizontal fringe creates a defined front edge that masks recession without looking like a cover-up. George Clooney made the Caesar mainstream during his ER years in the mid-1990s, and the style originally dates back to Julius Caesar himself, who reportedly wore his hair brushed forward to cover a thinning hairline. For men with a </w:t>
+        <w:t xml:space="preserve">The [Caesar haircut](https://stylexmagazine.com/caesar-haircut/) directs hair forward across the hairline — the exact area where thin straight hair exposes gaps first. That short horizontal fringe creates a defined front edge that masks recession without looking like a cover-up. George Clooney made the Caesar mainstream during his ER years in the mid-1990s, and the style originally dates back to Julius Caesar himself, who reportedly wore his hair brushed forward to cover a thinning hairline. For men with a </w:t>
       </w:r>
       <w:r>
         <w:rPr>
@@ -2063,25 +2081,7 @@
           <w:sz w:val="24"/>
           <w:szCs w:val="24"/>
         </w:rPr>
-        <w:t xml:space="preserve">The </w:t>
-      </w:r>
-      <w:r>
-        <w:rPr>
-          <w:rFonts w:ascii="Georgia" w:cs="Georgia" w:eastAsia="Georgia" w:hAnsi="Georgia"/>
-          <w:b/>
-          <w:bCs/>
-          <w:sz w:val="24"/>
-          <w:szCs w:val="24"/>
-        </w:rPr>
-        <w:t xml:space="preserve">high and tight</w:t>
-      </w:r>
-      <w:r>
-        <w:rPr>
-          <w:rFonts w:ascii="Georgia" w:cs="Georgia" w:eastAsia="Georgia" w:hAnsi="Georgia"/>
-          <w:sz w:val="24"/>
-          <w:szCs w:val="24"/>
-        </w:rPr>
-        <w:t xml:space="preserve"> removes everything that makes thin hair noticeable — length, layering, contrast. What remains is your bone structure and a sharp, masculine silhouette. This cut suits men with strong jawlines particularly well because the exposed sides frame the face without any hair softening the angles. On thin straight hair, the high and tight takes all the guesswork out. No styling, no product, no bad hair days. Trim every two weeks to keep it sharp.</w:t>
+        <w:t xml:space="preserve">The [high and tight haircut](https://stylexmagazine.com/high-tight-haircut/) removes everything that makes thin hair noticeable — length, layering, contrast. What remains is your bone structure and a sharp, masculine silhouette. This cut suits men with strong jawlines particularly well because the exposed sides frame the face without any hair softening the angles. On thin straight hair, the high and tight takes all the guesswork out. No styling, no product, no bad hair days. Trim every two weeks to keep it sharp.</w:t>
       </w:r>
     </w:p>
     <w:p>
@@ -3023,7 +3023,7 @@
           <w:sz w:val="24"/>
           <w:szCs w:val="24"/>
         </w:rPr>
-        <w:t xml:space="preserve">The disconnected undercut works on thin straight hair when the top still has enough density to cover the scalp when styled. The hard disconnect line creates a bold, graphic look — no one mistakes this for thinning. Straight hair falls cleanly over the disconnect, which is an advantage curly-haired men don't get. Style the top forward, to the side, or slicked back depending on face shape. For thin straight hair specifically, I'd recommend styling forward — it covers the most scalp area with the least hair.</w:t>
+        <w:t xml:space="preserve">The disconnected [undercut fade](https://stylexmagazine.com/undercut-fade-hairstyles/) works on thin straight hair when the top still has enough density to cover the scalp when styled. The hard disconnect line creates a bold, graphic look — no one mistakes this for thinning. Straight hair falls cleanly over the disconnect, which is an advantage curly-haired men don't get. Style the top forward, to the side, or slicked back depending on face shape. For thin straight hair specifically, I'd recommend styling forward — it covers the most scalp area with the least hair.</w:t>
       </w:r>
     </w:p>
     <w:p>
@@ -4499,7 +4499,7 @@
           <w:sz w:val="24"/>
           <w:szCs w:val="24"/>
         </w:rPr>
-        <w:t xml:space="preserve"> benefit from cuts with some width at the sides and fringe coverage at the forehead. The French crop, </w:t>
+        <w:t xml:space="preserve"> benefit from cuts with some width at the sides and fringe coverage at the forehead — see our guide to [haircuts for oblong faces](https://stylexmagazine.com/haircuts-for-oblong-faces-men/) for more options. The French crop, </w:t>
       </w:r>
       <w:r>
         <w:rPr>

</xml_diff>

<commit_message>
Convert non-live internal links to bold placeholders, add haircut designs placeholder
Co-Authored-By: Claude Opus 4.6 <noreply@anthropic.com>
Claude-Session: https://claude.ai/code/session_013k2EdyZEATdeqZhaNxEy9F
</commit_message>
<xml_diff>
--- a/Thin-Straight-Hair-Haircuts-for-Men.docx
+++ b/Thin-Straight-Hair-Haircuts-for-Men.docx
@@ -1049,7 +1049,25 @@
           <w:sz w:val="24"/>
           <w:szCs w:val="24"/>
         </w:rPr>
-        <w:t xml:space="preserve">The [Caesar haircut](https://stylexmagazine.com/caesar-haircut/) directs hair forward across the hairline — the exact area where thin straight hair exposes gaps first. That short horizontal fringe creates a defined front edge that masks recession without looking like a cover-up. George Clooney made the Caesar mainstream during his ER years in the mid-1990s, and the style originally dates back to Julius Caesar himself, who reportedly wore his hair brushed forward to cover a thinning hairline. For men with a </w:t>
+        <w:t xml:space="preserve">The </w:t>
+      </w:r>
+      <w:r>
+        <w:rPr>
+          <w:rFonts w:ascii="Georgia" w:cs="Georgia" w:eastAsia="Georgia" w:hAnsi="Georgia"/>
+          <w:b/>
+          <w:bCs/>
+          <w:sz w:val="24"/>
+          <w:szCs w:val="24"/>
+        </w:rPr>
+        <w:t xml:space="preserve">Caesar haircut</w:t>
+      </w:r>
+      <w:r>
+        <w:rPr>
+          <w:rFonts w:ascii="Georgia" w:cs="Georgia" w:eastAsia="Georgia" w:hAnsi="Georgia"/>
+          <w:sz w:val="24"/>
+          <w:szCs w:val="24"/>
+        </w:rPr>
+        <w:t xml:space="preserve"> directs hair forward across the hairline — the exact area where thin straight hair exposes gaps first. That short horizontal fringe creates a defined front edge that masks recession without looking like a cover-up. George Clooney made the Caesar mainstream during his ER years in the mid-1990s, and the style originally dates back to Julius Caesar himself, who reportedly wore his hair brushed forward to cover a thinning hairline. For men with a </w:t>
       </w:r>
       <w:r>
         <w:rPr>
@@ -2081,7 +2099,25 @@
           <w:sz w:val="24"/>
           <w:szCs w:val="24"/>
         </w:rPr>
-        <w:t xml:space="preserve">The [high and tight haircut](https://stylexmagazine.com/high-tight-haircut/) removes everything that makes thin hair noticeable — length, layering, contrast. What remains is your bone structure and a sharp, masculine silhouette. This cut suits men with strong jawlines particularly well because the exposed sides frame the face without any hair softening the angles. On thin straight hair, the high and tight takes all the guesswork out. No styling, no product, no bad hair days. Trim every two weeks to keep it sharp.</w:t>
+        <w:t xml:space="preserve">The </w:t>
+      </w:r>
+      <w:r>
+        <w:rPr>
+          <w:rFonts w:ascii="Georgia" w:cs="Georgia" w:eastAsia="Georgia" w:hAnsi="Georgia"/>
+          <w:b/>
+          <w:bCs/>
+          <w:sz w:val="24"/>
+          <w:szCs w:val="24"/>
+        </w:rPr>
+        <w:t xml:space="preserve">high and tight haircut</w:t>
+      </w:r>
+      <w:r>
+        <w:rPr>
+          <w:rFonts w:ascii="Georgia" w:cs="Georgia" w:eastAsia="Georgia" w:hAnsi="Georgia"/>
+          <w:sz w:val="24"/>
+          <w:szCs w:val="24"/>
+        </w:rPr>
+        <w:t xml:space="preserve"> removes everything that makes thin hair noticeable — length, layering, contrast. What remains is your bone structure and a sharp, masculine silhouette. This cut suits men with strong jawlines particularly well because the exposed sides frame the face without any hair softening the angles. On thin straight hair, the high and tight takes all the guesswork out. No styling, no product, no bad hair days. Trim every two weeks to keep it sharp.</w:t>
       </w:r>
     </w:p>
     <w:p>
@@ -3023,7 +3059,25 @@
           <w:sz w:val="24"/>
           <w:szCs w:val="24"/>
         </w:rPr>
-        <w:t xml:space="preserve">The disconnected [undercut fade](https://stylexmagazine.com/undercut-fade-hairstyles/) works on thin straight hair when the top still has enough density to cover the scalp when styled. The hard disconnect line creates a bold, graphic look — no one mistakes this for thinning. Straight hair falls cleanly over the disconnect, which is an advantage curly-haired men don't get. Style the top forward, to the side, or slicked back depending on face shape. For thin straight hair specifically, I'd recommend styling forward — it covers the most scalp area with the least hair.</w:t>
+        <w:t xml:space="preserve">The disconnected </w:t>
+      </w:r>
+      <w:r>
+        <w:rPr>
+          <w:rFonts w:ascii="Georgia" w:cs="Georgia" w:eastAsia="Georgia" w:hAnsi="Georgia"/>
+          <w:b/>
+          <w:bCs/>
+          <w:sz w:val="24"/>
+          <w:szCs w:val="24"/>
+        </w:rPr>
+        <w:t xml:space="preserve">undercut fade</w:t>
+      </w:r>
+      <w:r>
+        <w:rPr>
+          <w:rFonts w:ascii="Georgia" w:cs="Georgia" w:eastAsia="Georgia" w:hAnsi="Georgia"/>
+          <w:sz w:val="24"/>
+          <w:szCs w:val="24"/>
+        </w:rPr>
+        <w:t xml:space="preserve"> works on thin straight hair when the top still has enough density to cover the scalp when styled. The hard disconnect line creates a bold, graphic look — no one mistakes this for thinning. Straight hair falls cleanly over the disconnect, which is an advantage curly-haired men don't get. Style the top forward, to the side, or slicked back depending on face shape. For thin straight hair specifically, I'd recommend styling forward — it covers the most scalp area with the least hair.</w:t>
       </w:r>
     </w:p>
     <w:p>
@@ -4351,7 +4405,25 @@
           <w:sz w:val="24"/>
           <w:szCs w:val="24"/>
         </w:rPr>
-        <w:t xml:space="preserve">The [messy textured top](https://stylexmagazine.com/messy-hairstyles-men/) takes thin hair's biggest weakness — lack of structure — and turns it into the entire point of the style. Texturise the top with a sea salt spray or matte clay, tousle it with your fingers, and the hair looks styled rather than flat. The low fade keeps the bottom half tight so the rougher top looks intentional, not neglected. For men who want an effortless finish without the precision of a side part or quiff, this is the lowest-effort option that still looks put together.</w:t>
+        <w:t xml:space="preserve">The </w:t>
+      </w:r>
+      <w:r>
+        <w:rPr>
+          <w:rFonts w:ascii="Georgia" w:cs="Georgia" w:eastAsia="Georgia" w:hAnsi="Georgia"/>
+          <w:b/>
+          <w:bCs/>
+          <w:sz w:val="24"/>
+          <w:szCs w:val="24"/>
+        </w:rPr>
+        <w:t xml:space="preserve">messy textured top</w:t>
+      </w:r>
+      <w:r>
+        <w:rPr>
+          <w:rFonts w:ascii="Georgia" w:cs="Georgia" w:eastAsia="Georgia" w:hAnsi="Georgia"/>
+          <w:sz w:val="24"/>
+          <w:szCs w:val="24"/>
+        </w:rPr>
+        <w:t xml:space="preserve"> takes thin hair's biggest weakness — lack of structure — and turns it into the entire point of the style. Texturise the top with a sea salt spray or matte clay, tousle it with your fingers, and the hair looks styled rather than flat. The low fade keeps the bottom half tight so the rougher top looks intentional, not neglected. For men who want an effortless finish without the precision of a side part or quiff, this is the lowest-effort option that still looks put together.</w:t>
       </w:r>
     </w:p>
     <w:p>
@@ -5097,7 +5169,25 @@
           <w:sz w:val="24"/>
           <w:szCs w:val="24"/>
         </w:rPr>
-        <w:t xml:space="preserve"> On thin straight hair, a sharp line between lengths shows every density change. A gradual taper or fade hides the transition.</w:t>
+        <w:t xml:space="preserve"> If you're considering detailed </w:t>
+      </w:r>
+      <w:r>
+        <w:rPr>
+          <w:rFonts w:ascii="Georgia" w:cs="Georgia" w:eastAsia="Georgia" w:hAnsi="Georgia"/>
+          <w:b/>
+          <w:bCs/>
+          <w:sz w:val="24"/>
+          <w:szCs w:val="24"/>
+        </w:rPr>
+        <w:t xml:space="preserve">haircut designs</w:t>
+      </w:r>
+      <w:r>
+        <w:rPr>
+          <w:rFonts w:ascii="Georgia" w:cs="Georgia" w:eastAsia="Georgia" w:hAnsi="Georgia"/>
+          <w:sz w:val="24"/>
+          <w:szCs w:val="24"/>
+        </w:rPr>
+        <w:t xml:space="preserve"> like razor lines or etched patterns, keep them on the fade area where hair is dense — never near thinning zones where they'll highlight sparse patches. On thin straight hair, a sharp line between lengths shows every density change. A gradual taper or fade hides the transition.</w:t>
       </w:r>
     </w:p>
     <w:p>

</xml_diff>